<commit_message>
fixing finals to be identical with drafts: 6/4/26
</commit_message>
<xml_diff>
--- a/backend/src/templates/word-template-final.docx
+++ b/backend/src/templates/word-template-final.docx
@@ -2,14 +2,14 @@
 <file path=word/document.xml><?xml version="1.0" encoding="utf-8"?>
 <w:document xmlns:wpc="http://schemas.microsoft.com/office/word/2010/wordprocessingCanvas" xmlns:cx="http://schemas.microsoft.com/office/drawing/2014/chartex" xmlns:cx1="http://schemas.microsoft.com/office/drawing/2015/9/8/chartex" xmlns:cx2="http://schemas.microsoft.com/office/drawing/2015/10/21/chartex" xmlns:cx3="http://schemas.microsoft.com/office/drawing/2016/5/9/chartex" xmlns:cx4="http://schemas.microsoft.com/office/drawing/2016/5/10/chartex" xmlns:cx5="http://schemas.microsoft.com/office/drawing/2016/5/11/chartex" xmlns:cx6="http://schemas.microsoft.com/office/drawing/2016/5/12/chartex" xmlns:cx7="http://schemas.microsoft.com/office/drawing/2016/5/13/chartex" xmlns:cx8="http://schemas.microsoft.com/office/drawing/2016/5/14/chartex" xmlns:mc="http://schemas.openxmlformats.org/markup-compatibility/2006" xmlns:aink="http://schemas.microsoft.com/office/drawing/2016/ink" xmlns:am3d="http://schemas.microsoft.com/office/drawing/2017/model3d" xmlns:o="urn:schemas-microsoft-com:office:office" xmlns:oel="http://schemas.microsoft.com/office/2019/extlst" xmlns:r="http://schemas.openxmlformats.org/officeDocument/2006/relationships" xmlns:m="http://schemas.openxmlformats.org/officeDocument/2006/math" xmlns:v="urn:schemas-microsoft-com:vml" xmlns:wp14="http://schemas.microsoft.com/office/word/2010/wordprocessingDrawing" xmlns:wp="http://schemas.openxmlformats.org/drawingml/2006/wordprocessingDrawing" xmlns:w10="urn:schemas-microsoft-com:office:word" xmlns:w="http://schemas.openxmlformats.org/wordprocessingml/2006/main" xmlns:w14="http://schemas.microsoft.com/office/word/2010/wordml" xmlns:w15="http://schemas.microsoft.com/office/word/2012/wordml" xmlns:w16cex="http://schemas.microsoft.com/office/word/2018/wordml/cex" xmlns:w16cid="http://schemas.microsoft.com/office/word/2016/wordml/cid" xmlns:w16="http://schemas.microsoft.com/office/word/2018/wordml" xmlns:w16du="http://schemas.microsoft.com/office/word/2023/wordml/word16du" xmlns:w16sdtdh="http://schemas.microsoft.com/office/word/2020/wordml/sdtdatahash" xmlns:w16sdtfl="http://schemas.microsoft.com/office/word/2024/wordml/sdtformatlock" xmlns:w16se="http://schemas.microsoft.com/office/word/2015/wordml/symex" xmlns:wpg="http://schemas.microsoft.com/office/word/2010/wordprocessingGroup" xmlns:wpi="http://schemas.microsoft.com/office/word/2010/wordprocessingInk" xmlns:wne="http://schemas.microsoft.com/office/word/2006/wordml" xmlns:wps="http://schemas.microsoft.com/office/word/2010/wordprocessingShape" mc:Ignorable="w14 w15 w16se w16cid w16 w16cex w16sdtdh w16sdtfl w16du wp14">
   <w:body>
-    <w:bookmarkStart w:id="0" w:name="_Toc219402266"/>
-    <w:bookmarkStart w:id="1" w:name="_Toc219402532"/>
     <w:p>
       <w:pPr>
         <w:rPr>
           <w:szCs w:val="30"/>
         </w:rPr>
       </w:pPr>
+      <w:bookmarkStart w:id="0" w:name="_Toc219402266"/>
+      <w:bookmarkStart w:id="1" w:name="_Toc219402532"/>
       <w:r>
         <w:rPr>
           <w:noProof/>
@@ -227,6 +227,33 @@
                                 <w:rFonts w:ascii="Arial" w:hAnsi="Arial"/>
                               </w:rPr>
                               <w:t>{version}</w:t>
+                            </w:r>
+                          </w:p>
+                          <w:p>
+                            <w:pPr>
+                              <w:rPr>
+                                <w:rFonts w:ascii="Arial" w:hAnsi="Arial"/>
+                              </w:rPr>
+                            </w:pPr>
+                            <w:r>
+                              <w:rPr>
+                                <w:rFonts w:ascii="Arial" w:hAnsi="Arial"/>
+                              </w:rPr>
+                              <w:t>{</w:t>
+                            </w:r>
+                            <w:proofErr w:type="spellStart"/>
+                            <w:r>
+                              <w:rPr>
+                                <w:rFonts w:ascii="Arial" w:hAnsi="Arial"/>
+                              </w:rPr>
+                              <w:t>quoteIdLine</w:t>
+                            </w:r>
+                            <w:proofErr w:type="spellEnd"/>
+                            <w:r>
+                              <w:rPr>
+                                <w:rFonts w:ascii="Arial" w:hAnsi="Arial"/>
+                              </w:rPr>
+                              <w:t>}</w:t>
                             </w:r>
                             <w:r>
                               <w:rPr>
@@ -661,6 +688,33 @@
                         </w:rPr>
                         <w:t>{version}</w:t>
                       </w:r>
+                    </w:p>
+                    <w:p>
+                      <w:pPr>
+                        <w:rPr>
+                          <w:rFonts w:ascii="Arial" w:hAnsi="Arial"/>
+                        </w:rPr>
+                      </w:pPr>
+                      <w:r>
+                        <w:rPr>
+                          <w:rFonts w:ascii="Arial" w:hAnsi="Arial"/>
+                        </w:rPr>
+                        <w:t>{</w:t>
+                      </w:r>
+                      <w:proofErr w:type="spellStart"/>
+                      <w:r>
+                        <w:rPr>
+                          <w:rFonts w:ascii="Arial" w:hAnsi="Arial"/>
+                        </w:rPr>
+                        <w:t>quoteIdLine</w:t>
+                      </w:r>
+                      <w:proofErr w:type="spellEnd"/>
+                      <w:r>
+                        <w:rPr>
+                          <w:rFonts w:ascii="Arial" w:hAnsi="Arial"/>
+                        </w:rPr>
+                        <w:t>}</w:t>
+                      </w:r>
                       <w:r>
                         <w:rPr>
                           <w:rFonts w:ascii="Arial" w:hAnsi="Arial"/>
@@ -1427,15 +1481,7 @@
           <w:rFonts w:ascii="Arial" w:hAnsi="Arial" w:cs="Arial"/>
         </w:rPr>
         <w:lastRenderedPageBreak/>
-        <w:t>{#</w:t>
-      </w:r>
-      <w:proofErr w:type="gramStart"/>
-      <w:r>
-        <w:rPr>
-          <w:rStyle w:val="Heading1Char"/>
-          <w:rFonts w:ascii="Arial" w:hAnsi="Arial" w:cs="Arial"/>
-        </w:rPr>
-        <w:t>sections}</w:t>
+        <w:t>{#sections}</w:t>
       </w:r>
       <w:bookmarkStart w:id="5" w:name="_Toc210082016"/>
       <w:bookmarkStart w:id="6" w:name="_Toc210690087"/>
@@ -1463,15 +1509,7 @@
           <w:rStyle w:val="Heading1Char"/>
           <w:rFonts w:ascii="Arial" w:hAnsi="Arial" w:cs="Arial"/>
         </w:rPr>
-        <w:t>{</w:t>
-      </w:r>
-      <w:proofErr w:type="gramEnd"/>
-      <w:r>
-        <w:rPr>
-          <w:rStyle w:val="Heading1Char"/>
-          <w:rFonts w:ascii="Arial" w:hAnsi="Arial" w:cs="Arial"/>
-        </w:rPr>
-        <w:t>sectionNumber}. {title}</w:t>
+        <w:t>{sectionNumber}. {title}</w:t>
       </w:r>
       <w:bookmarkEnd w:id="4"/>
       <w:bookmarkEnd w:id="5"/>
@@ -1499,21 +1537,7 @@
         <w:rPr>
           <w:rFonts w:ascii="Arial" w:hAnsi="Arial" w:cs="Arial"/>
         </w:rPr>
-        <w:t>{#</w:t>
-      </w:r>
-      <w:proofErr w:type="gramStart"/>
-      <w:r>
-        <w:rPr>
-          <w:rFonts w:ascii="Arial" w:hAnsi="Arial" w:cs="Arial"/>
-        </w:rPr>
-        <w:t>modules}{</w:t>
-      </w:r>
-      <w:proofErr w:type="gramEnd"/>
-      <w:r>
-        <w:rPr>
-          <w:rFonts w:ascii="Arial" w:hAnsi="Arial" w:cs="Arial"/>
-        </w:rPr>
-        <w:t>#hasName}</w:t>
+        <w:t>{#modules}{#hasName}</w:t>
       </w:r>
       <w:bookmarkEnd w:id="2"/>
       <w:bookmarkEnd w:id="3"/>
@@ -1573,7 +1597,6 @@
         <w:t>{/</w:t>
       </w:r>
       <w:proofErr w:type="spellStart"/>
-      <w:proofErr w:type="gramStart"/>
       <w:r>
         <w:rPr>
           <w:rFonts w:ascii="Arial" w:hAnsi="Arial" w:cs="Arial"/>
@@ -1585,28 +1608,7 @@
         <w:rPr>
           <w:rFonts w:ascii="Arial" w:hAnsi="Arial" w:cs="Arial"/>
         </w:rPr>
-        <w:t>}{</w:t>
-      </w:r>
-      <w:proofErr w:type="gramEnd"/>
-      <w:r>
-        <w:rPr>
-          <w:rFonts w:ascii="Arial" w:hAnsi="Arial" w:cs="Arial"/>
-        </w:rPr>
-        <w:t>#</w:t>
-      </w:r>
-      <w:proofErr w:type="gramStart"/>
-      <w:r>
-        <w:rPr>
-          <w:rFonts w:ascii="Arial" w:hAnsi="Arial" w:cs="Arial"/>
-        </w:rPr>
-        <w:t>blocks}{</w:t>
-      </w:r>
-      <w:proofErr w:type="gramEnd"/>
-      <w:r>
-        <w:rPr>
-          <w:rFonts w:ascii="Arial" w:hAnsi="Arial" w:cs="Arial"/>
-        </w:rPr>
-        <w:t>#isParagraph}</w:t>
+        <w:t>}{#blocks}{#isParagraph}</w:t>
       </w:r>
       <w:bookmarkEnd w:id="29"/>
       <w:bookmarkEnd w:id="30"/>
@@ -1626,7 +1628,6 @@
         <w:t>{text}{/</w:t>
       </w:r>
       <w:proofErr w:type="spellStart"/>
-      <w:proofErr w:type="gramStart"/>
       <w:r>
         <w:rPr>
           <w:rFonts w:ascii="Arial" w:hAnsi="Arial" w:cs="Arial"/>
@@ -1638,56 +1639,7 @@
         <w:rPr>
           <w:rFonts w:ascii="Arial" w:hAnsi="Arial" w:cs="Arial"/>
         </w:rPr>
-        <w:t>}{</w:t>
-      </w:r>
-      <w:proofErr w:type="gramEnd"/>
-      <w:r>
-        <w:rPr>
-          <w:rFonts w:ascii="Arial" w:hAnsi="Arial" w:cs="Arial"/>
-        </w:rPr>
-        <w:t>#</w:t>
-      </w:r>
-      <w:proofErr w:type="gramStart"/>
-      <w:r>
-        <w:rPr>
-          <w:rFonts w:ascii="Arial" w:hAnsi="Arial" w:cs="Arial"/>
-        </w:rPr>
-        <w:t>isList}{</w:t>
-      </w:r>
-      <w:proofErr w:type="gramEnd"/>
-      <w:r>
-        <w:rPr>
-          <w:rFonts w:ascii="Arial" w:hAnsi="Arial" w:cs="Arial"/>
-        </w:rPr>
-        <w:t>#</w:t>
-      </w:r>
-      <w:proofErr w:type="gramStart"/>
-      <w:r>
-        <w:rPr>
-          <w:rFonts w:ascii="Arial" w:hAnsi="Arial" w:cs="Arial"/>
-        </w:rPr>
-        <w:t>isNumberList}{</w:t>
-      </w:r>
-      <w:proofErr w:type="gramEnd"/>
-      <w:r>
-        <w:rPr>
-          <w:rFonts w:ascii="Arial" w:hAnsi="Arial" w:cs="Arial"/>
-        </w:rPr>
-        <w:t>#</w:t>
-      </w:r>
-      <w:proofErr w:type="gramStart"/>
-      <w:r>
-        <w:rPr>
-          <w:rFonts w:ascii="Arial" w:hAnsi="Arial" w:cs="Arial"/>
-        </w:rPr>
-        <w:t>items}{</w:t>
-      </w:r>
-      <w:proofErr w:type="gramEnd"/>
-      <w:r>
-        <w:rPr>
-          <w:rFonts w:ascii="Arial" w:hAnsi="Arial" w:cs="Arial"/>
-        </w:rPr>
-        <w:t>#isDepth0}</w:t>
+        <w:t>}{#isList}{#isNumberList}{#items}{#isDepth0}</w:t>
       </w:r>
     </w:p>
     <w:p>
@@ -1702,21 +1654,7 @@
         <w:rPr>
           <w:rFonts w:ascii="Arial" w:hAnsi="Arial" w:cs="Arial"/>
         </w:rPr>
-        <w:t xml:space="preserve">      {index}. {text}{/isDepth</w:t>
-      </w:r>
-      <w:proofErr w:type="gramStart"/>
-      <w:r>
-        <w:rPr>
-          <w:rFonts w:ascii="Arial" w:hAnsi="Arial" w:cs="Arial"/>
-        </w:rPr>
-        <w:t>0}{</w:t>
-      </w:r>
-      <w:proofErr w:type="gramEnd"/>
-      <w:r>
-        <w:rPr>
-          <w:rFonts w:ascii="Arial" w:hAnsi="Arial" w:cs="Arial"/>
-        </w:rPr>
-        <w:t>#isDepth1}</w:t>
+        <w:t xml:space="preserve">      {index}. {text}{/isDepth0}{#isDepth1}</w:t>
       </w:r>
     </w:p>
     <w:p>
@@ -1731,21 +1669,7 @@
         <w:rPr>
           <w:rFonts w:ascii="Arial" w:hAnsi="Arial" w:cs="Arial"/>
         </w:rPr>
-        <w:t>{index}. {text}{/isDepth</w:t>
-      </w:r>
-      <w:proofErr w:type="gramStart"/>
-      <w:r>
-        <w:rPr>
-          <w:rFonts w:ascii="Arial" w:hAnsi="Arial" w:cs="Arial"/>
-        </w:rPr>
-        <w:t>1}{</w:t>
-      </w:r>
-      <w:proofErr w:type="gramEnd"/>
-      <w:r>
-        <w:rPr>
-          <w:rFonts w:ascii="Arial" w:hAnsi="Arial" w:cs="Arial"/>
-        </w:rPr>
-        <w:t>#isDepth2}</w:t>
+        <w:t>{index}. {text}{/isDepth1}{#isDepth2}</w:t>
       </w:r>
     </w:p>
     <w:p>
@@ -1760,21 +1684,7 @@
         <w:rPr>
           <w:rFonts w:ascii="Arial" w:hAnsi="Arial" w:cs="Arial"/>
         </w:rPr>
-        <w:t xml:space="preserve">              {index}. {text}{/isDepth</w:t>
-      </w:r>
-      <w:proofErr w:type="gramStart"/>
-      <w:r>
-        <w:rPr>
-          <w:rFonts w:ascii="Arial" w:hAnsi="Arial" w:cs="Arial"/>
-        </w:rPr>
-        <w:t>2}{</w:t>
-      </w:r>
-      <w:proofErr w:type="gramEnd"/>
-      <w:r>
-        <w:rPr>
-          <w:rFonts w:ascii="Arial" w:hAnsi="Arial" w:cs="Arial"/>
-        </w:rPr>
-        <w:t>#isDepth3}</w:t>
+        <w:t xml:space="preserve">              {index}. {text}{/isDepth2}{#isDepth3}</w:t>
       </w:r>
     </w:p>
     <w:p>
@@ -1796,49 +1706,7 @@
           <w:rFonts w:ascii="Arial" w:hAnsi="Arial" w:cs="Arial"/>
         </w:rPr>
         <w:tab/>
-        <w:t xml:space="preserve">                {index}. {text}{/isDepth</w:t>
-      </w:r>
-      <w:proofErr w:type="gramStart"/>
-      <w:r>
-        <w:rPr>
-          <w:rFonts w:ascii="Arial" w:hAnsi="Arial" w:cs="Arial"/>
-        </w:rPr>
-        <w:t>3}{</w:t>
-      </w:r>
-      <w:proofErr w:type="gramEnd"/>
-      <w:r>
-        <w:rPr>
-          <w:rFonts w:ascii="Arial" w:hAnsi="Arial" w:cs="Arial"/>
-        </w:rPr>
-        <w:t>#</w:t>
-      </w:r>
-      <w:proofErr w:type="gramStart"/>
-      <w:r>
-        <w:rPr>
-          <w:rFonts w:ascii="Arial" w:hAnsi="Arial" w:cs="Arial"/>
-        </w:rPr>
-        <w:t>hasNested}{</w:t>
-      </w:r>
-      <w:proofErr w:type="gramEnd"/>
-      <w:r>
-        <w:rPr>
-          <w:rFonts w:ascii="Arial" w:hAnsi="Arial" w:cs="Arial"/>
-        </w:rPr>
-        <w:t>#</w:t>
-      </w:r>
-      <w:proofErr w:type="gramStart"/>
-      <w:r>
-        <w:rPr>
-          <w:rFonts w:ascii="Arial" w:hAnsi="Arial" w:cs="Arial"/>
-        </w:rPr>
-        <w:t>nestedItems}{</w:t>
-      </w:r>
-      <w:proofErr w:type="gramEnd"/>
-      <w:r>
-        <w:rPr>
-          <w:rFonts w:ascii="Arial" w:hAnsi="Arial" w:cs="Arial"/>
-        </w:rPr>
-        <w:t>#isDepth1}</w:t>
+        <w:t xml:space="preserve">                {index}. {text}{/isDepth3}{#hasNested}{#nestedItems}{#isDepth1}</w:t>
       </w:r>
     </w:p>
     <w:p>
@@ -1853,21 +1721,7 @@
         <w:rPr>
           <w:rFonts w:ascii="Arial" w:hAnsi="Arial" w:cs="Arial"/>
         </w:rPr>
-        <w:t xml:space="preserve">               {index}. {text}{/isDepth</w:t>
-      </w:r>
-      <w:proofErr w:type="gramStart"/>
-      <w:r>
-        <w:rPr>
-          <w:rFonts w:ascii="Arial" w:hAnsi="Arial" w:cs="Arial"/>
-        </w:rPr>
-        <w:t>1}{</w:t>
-      </w:r>
-      <w:proofErr w:type="gramEnd"/>
-      <w:r>
-        <w:rPr>
-          <w:rFonts w:ascii="Arial" w:hAnsi="Arial" w:cs="Arial"/>
-        </w:rPr>
-        <w:t>#isDepth2}</w:t>
+        <w:t xml:space="preserve">               {index}. {text}{/isDepth1}{#isDepth2}</w:t>
       </w:r>
     </w:p>
     <w:p>
@@ -1882,21 +1736,7 @@
         <w:rPr>
           <w:rFonts w:ascii="Arial" w:hAnsi="Arial" w:cs="Arial"/>
         </w:rPr>
-        <w:t xml:space="preserve">                                       {index}. {text}{/isDepth</w:t>
-      </w:r>
-      <w:proofErr w:type="gramStart"/>
-      <w:r>
-        <w:rPr>
-          <w:rFonts w:ascii="Arial" w:hAnsi="Arial" w:cs="Arial"/>
-        </w:rPr>
-        <w:t>2}{</w:t>
-      </w:r>
-      <w:proofErr w:type="gramEnd"/>
-      <w:r>
-        <w:rPr>
-          <w:rFonts w:ascii="Arial" w:hAnsi="Arial" w:cs="Arial"/>
-        </w:rPr>
-        <w:t>#isDepth3}</w:t>
+        <w:t xml:space="preserve">                                       {index}. {text}{/isDepth2}{#isDepth3}</w:t>
       </w:r>
     </w:p>
     <w:p>
@@ -1910,49 +1750,7 @@
         <w:rPr>
           <w:rFonts w:ascii="Arial" w:hAnsi="Arial" w:cs="Arial"/>
         </w:rPr>
-        <w:t xml:space="preserve">                        {index}. {text}{/isDepth</w:t>
-      </w:r>
-      <w:proofErr w:type="gramStart"/>
-      <w:r>
-        <w:rPr>
-          <w:rFonts w:ascii="Arial" w:hAnsi="Arial" w:cs="Arial"/>
-        </w:rPr>
-        <w:t>3}{</w:t>
-      </w:r>
-      <w:proofErr w:type="gramEnd"/>
-      <w:r>
-        <w:rPr>
-          <w:rFonts w:ascii="Arial" w:hAnsi="Arial" w:cs="Arial"/>
-        </w:rPr>
-        <w:t>#</w:t>
-      </w:r>
-      <w:proofErr w:type="gramStart"/>
-      <w:r>
-        <w:rPr>
-          <w:rFonts w:ascii="Arial" w:hAnsi="Arial" w:cs="Arial"/>
-        </w:rPr>
-        <w:t>hasNested}{</w:t>
-      </w:r>
-      <w:proofErr w:type="gramEnd"/>
-      <w:r>
-        <w:rPr>
-          <w:rFonts w:ascii="Arial" w:hAnsi="Arial" w:cs="Arial"/>
-        </w:rPr>
-        <w:t>#</w:t>
-      </w:r>
-      <w:proofErr w:type="gramStart"/>
-      <w:r>
-        <w:rPr>
-          <w:rFonts w:ascii="Arial" w:hAnsi="Arial" w:cs="Arial"/>
-        </w:rPr>
-        <w:t>nestedItems}{</w:t>
-      </w:r>
-      <w:proofErr w:type="gramEnd"/>
-      <w:r>
-        <w:rPr>
-          <w:rFonts w:ascii="Arial" w:hAnsi="Arial" w:cs="Arial"/>
-        </w:rPr>
-        <w:t>#isDepth2}</w:t>
+        <w:t xml:space="preserve">                        {index}. {text}{/isDepth3}{#hasNested}{#nestedItems}{#isDepth2}</w:t>
       </w:r>
     </w:p>
     <w:p>
@@ -1967,21 +1765,7 @@
         <w:rPr>
           <w:rFonts w:ascii="Arial" w:hAnsi="Arial" w:cs="Arial"/>
         </w:rPr>
-        <w:t xml:space="preserve">                    {index}. {text}{/isDepth</w:t>
-      </w:r>
-      <w:proofErr w:type="gramStart"/>
-      <w:r>
-        <w:rPr>
-          <w:rFonts w:ascii="Arial" w:hAnsi="Arial" w:cs="Arial"/>
-        </w:rPr>
-        <w:t>2}{</w:t>
-      </w:r>
-      <w:proofErr w:type="gramEnd"/>
-      <w:r>
-        <w:rPr>
-          <w:rFonts w:ascii="Arial" w:hAnsi="Arial" w:cs="Arial"/>
-        </w:rPr>
-        <w:t>#isDepth3}</w:t>
+        <w:t xml:space="preserve">                    {index}. {text}{/isDepth2}{#isDepth3}</w:t>
       </w:r>
     </w:p>
     <w:p>
@@ -1996,49 +1780,7 @@
         <w:rPr>
           <w:rFonts w:ascii="Arial" w:hAnsi="Arial" w:cs="Arial"/>
         </w:rPr>
-        <w:t xml:space="preserve">                        {index}. {text}{/isDepth</w:t>
-      </w:r>
-      <w:proofErr w:type="gramStart"/>
-      <w:r>
-        <w:rPr>
-          <w:rFonts w:ascii="Arial" w:hAnsi="Arial" w:cs="Arial"/>
-        </w:rPr>
-        <w:t>3}{</w:t>
-      </w:r>
-      <w:proofErr w:type="gramEnd"/>
-      <w:r>
-        <w:rPr>
-          <w:rFonts w:ascii="Arial" w:hAnsi="Arial" w:cs="Arial"/>
-        </w:rPr>
-        <w:t>#</w:t>
-      </w:r>
-      <w:proofErr w:type="gramStart"/>
-      <w:r>
-        <w:rPr>
-          <w:rFonts w:ascii="Arial" w:hAnsi="Arial" w:cs="Arial"/>
-        </w:rPr>
-        <w:t>hasNested}{</w:t>
-      </w:r>
-      <w:proofErr w:type="gramEnd"/>
-      <w:r>
-        <w:rPr>
-          <w:rFonts w:ascii="Arial" w:hAnsi="Arial" w:cs="Arial"/>
-        </w:rPr>
-        <w:t>#</w:t>
-      </w:r>
-      <w:proofErr w:type="gramStart"/>
-      <w:r>
-        <w:rPr>
-          <w:rFonts w:ascii="Arial" w:hAnsi="Arial" w:cs="Arial"/>
-        </w:rPr>
-        <w:t>nestedItems}{</w:t>
-      </w:r>
-      <w:proofErr w:type="gramEnd"/>
-      <w:r>
-        <w:rPr>
-          <w:rFonts w:ascii="Arial" w:hAnsi="Arial" w:cs="Arial"/>
-        </w:rPr>
-        <w:t>#isDepth3}</w:t>
+        <w:t xml:space="preserve">                        {index}. {text}{/isDepth3}{#hasNested}{#nestedItems}{#isDepth3}</w:t>
       </w:r>
     </w:p>
     <w:p>
@@ -2053,77 +1795,7 @@
         <w:rPr>
           <w:rFonts w:ascii="Arial" w:hAnsi="Arial" w:cs="Arial"/>
         </w:rPr>
-        <w:t xml:space="preserve">                        {index}. {text}{/isDepth</w:t>
-      </w:r>
-      <w:proofErr w:type="gramStart"/>
-      <w:r>
-        <w:rPr>
-          <w:rFonts w:ascii="Arial" w:hAnsi="Arial" w:cs="Arial"/>
-        </w:rPr>
-        <w:t>3}{</w:t>
-      </w:r>
-      <w:proofErr w:type="gramEnd"/>
-      <w:r>
-        <w:rPr>
-          <w:rFonts w:ascii="Arial" w:hAnsi="Arial" w:cs="Arial"/>
-        </w:rPr>
-        <w:t>/</w:t>
-      </w:r>
-      <w:proofErr w:type="gramStart"/>
-      <w:r>
-        <w:rPr>
-          <w:rFonts w:ascii="Arial" w:hAnsi="Arial" w:cs="Arial"/>
-        </w:rPr>
-        <w:t>nestedItems}{</w:t>
-      </w:r>
-      <w:proofErr w:type="gramEnd"/>
-      <w:r>
-        <w:rPr>
-          <w:rFonts w:ascii="Arial" w:hAnsi="Arial" w:cs="Arial"/>
-        </w:rPr>
-        <w:t>/</w:t>
-      </w:r>
-      <w:proofErr w:type="gramStart"/>
-      <w:r>
-        <w:rPr>
-          <w:rFonts w:ascii="Arial" w:hAnsi="Arial" w:cs="Arial"/>
-        </w:rPr>
-        <w:t>hasNested}{</w:t>
-      </w:r>
-      <w:proofErr w:type="gramEnd"/>
-      <w:r>
-        <w:rPr>
-          <w:rFonts w:ascii="Arial" w:hAnsi="Arial" w:cs="Arial"/>
-        </w:rPr>
-        <w:t>/</w:t>
-      </w:r>
-      <w:proofErr w:type="gramStart"/>
-      <w:r>
-        <w:rPr>
-          <w:rFonts w:ascii="Arial" w:hAnsi="Arial" w:cs="Arial"/>
-        </w:rPr>
-        <w:t>nestedItems}{</w:t>
-      </w:r>
-      <w:proofErr w:type="gramEnd"/>
-      <w:r>
-        <w:rPr>
-          <w:rFonts w:ascii="Arial" w:hAnsi="Arial" w:cs="Arial"/>
-        </w:rPr>
-        <w:t>/</w:t>
-      </w:r>
-      <w:proofErr w:type="gramStart"/>
-      <w:r>
-        <w:rPr>
-          <w:rFonts w:ascii="Arial" w:hAnsi="Arial" w:cs="Arial"/>
-        </w:rPr>
-        <w:t>hasNested}{</w:t>
-      </w:r>
-      <w:proofErr w:type="gramEnd"/>
-      <w:r>
-        <w:rPr>
-          <w:rFonts w:ascii="Arial" w:hAnsi="Arial" w:cs="Arial"/>
-        </w:rPr>
-        <w:t>/nestedItems}</w:t>
+        <w:t xml:space="preserve">                        {index}. {text}{/isDepth3}{/nestedItems}{/hasNested}{/nestedItems}{/hasNested}{/nestedItems}</w:t>
       </w:r>
     </w:p>
     <w:p>
@@ -2137,77 +1809,7 @@
         <w:rPr>
           <w:rFonts w:ascii="Arial" w:hAnsi="Arial" w:cs="Arial"/>
         </w:rPr>
-        <w:t>{/</w:t>
-      </w:r>
-      <w:proofErr w:type="gramStart"/>
-      <w:r>
-        <w:rPr>
-          <w:rFonts w:ascii="Arial" w:hAnsi="Arial" w:cs="Arial"/>
-        </w:rPr>
-        <w:t>hasNested}{</w:t>
-      </w:r>
-      <w:proofErr w:type="gramEnd"/>
-      <w:r>
-        <w:rPr>
-          <w:rFonts w:ascii="Arial" w:hAnsi="Arial" w:cs="Arial"/>
-        </w:rPr>
-        <w:t>/</w:t>
-      </w:r>
-      <w:proofErr w:type="gramStart"/>
-      <w:r>
-        <w:rPr>
-          <w:rFonts w:ascii="Arial" w:hAnsi="Arial" w:cs="Arial"/>
-        </w:rPr>
-        <w:t>items}{</w:t>
-      </w:r>
-      <w:proofErr w:type="gramEnd"/>
-      <w:r>
-        <w:rPr>
-          <w:rFonts w:ascii="Arial" w:hAnsi="Arial" w:cs="Arial"/>
-        </w:rPr>
-        <w:t>/</w:t>
-      </w:r>
-      <w:proofErr w:type="gramStart"/>
-      <w:r>
-        <w:rPr>
-          <w:rFonts w:ascii="Arial" w:hAnsi="Arial" w:cs="Arial"/>
-        </w:rPr>
-        <w:t>isNumberList}{</w:t>
-      </w:r>
-      <w:proofErr w:type="gramEnd"/>
-      <w:r>
-        <w:rPr>
-          <w:rFonts w:ascii="Arial" w:hAnsi="Arial" w:cs="Arial"/>
-        </w:rPr>
-        <w:t>#</w:t>
-      </w:r>
-      <w:proofErr w:type="gramStart"/>
-      <w:r>
-        <w:rPr>
-          <w:rFonts w:ascii="Arial" w:hAnsi="Arial" w:cs="Arial"/>
-        </w:rPr>
-        <w:t>isBulletList}{</w:t>
-      </w:r>
-      <w:proofErr w:type="gramEnd"/>
-      <w:r>
-        <w:rPr>
-          <w:rFonts w:ascii="Arial" w:hAnsi="Arial" w:cs="Arial"/>
-        </w:rPr>
-        <w:t>#</w:t>
-      </w:r>
-      <w:proofErr w:type="gramStart"/>
-      <w:r>
-        <w:rPr>
-          <w:rFonts w:ascii="Arial" w:hAnsi="Arial" w:cs="Arial"/>
-        </w:rPr>
-        <w:t>items}{</w:t>
-      </w:r>
-      <w:proofErr w:type="gramEnd"/>
-      <w:r>
-        <w:rPr>
-          <w:rFonts w:ascii="Arial" w:hAnsi="Arial" w:cs="Arial"/>
-        </w:rPr>
-        <w:t>#isDepth0}</w:t>
+        <w:t>{/hasNested}{/items}{/isNumberList}{#isBulletList}{#items}{#isDepth0}</w:t>
       </w:r>
     </w:p>
     <w:p>
@@ -2222,35 +1824,7 @@
         <w:rPr>
           <w:rFonts w:ascii="Arial" w:hAnsi="Arial" w:cs="Arial"/>
         </w:rPr>
-        <w:t xml:space="preserve">      </w:t>
-      </w:r>
-      <w:proofErr w:type="gramStart"/>
-      <w:r>
-        <w:rPr>
-          <w:rFonts w:ascii="Arial" w:hAnsi="Arial" w:cs="Arial"/>
-        </w:rPr>
-        <w:t>•  {</w:t>
-      </w:r>
-      <w:proofErr w:type="gramEnd"/>
-      <w:r>
-        <w:rPr>
-          <w:rFonts w:ascii="Arial" w:hAnsi="Arial" w:cs="Arial"/>
-        </w:rPr>
-        <w:t>text}{/isDepth</w:t>
-      </w:r>
-      <w:proofErr w:type="gramStart"/>
-      <w:r>
-        <w:rPr>
-          <w:rFonts w:ascii="Arial" w:hAnsi="Arial" w:cs="Arial"/>
-        </w:rPr>
-        <w:t>0}{</w:t>
-      </w:r>
-      <w:proofErr w:type="gramEnd"/>
-      <w:r>
-        <w:rPr>
-          <w:rFonts w:ascii="Arial" w:hAnsi="Arial" w:cs="Arial"/>
-        </w:rPr>
-        <w:t>#isDepth1}</w:t>
+        <w:t xml:space="preserve">      •  {text}{/isDepth0}{#isDepth1}</w:t>
       </w:r>
     </w:p>
     <w:p>
@@ -2270,21 +1844,7 @@
         <w:rPr>
           <w:rFonts w:ascii="Arial" w:hAnsi="Arial" w:cs="Arial"/>
         </w:rPr>
-        <w:t xml:space="preserve"> • {text}{/isDepth</w:t>
-      </w:r>
-      <w:proofErr w:type="gramStart"/>
-      <w:r>
-        <w:rPr>
-          <w:rFonts w:ascii="Arial" w:hAnsi="Arial" w:cs="Arial"/>
-        </w:rPr>
-        <w:t>1}{</w:t>
-      </w:r>
-      <w:proofErr w:type="gramEnd"/>
-      <w:r>
-        <w:rPr>
-          <w:rFonts w:ascii="Arial" w:hAnsi="Arial" w:cs="Arial"/>
-        </w:rPr>
-        <w:t>#isDepth2}</w:t>
+        <w:t xml:space="preserve"> • {text}{/isDepth1}{#isDepth2}</w:t>
       </w:r>
     </w:p>
     <w:p>
@@ -2298,35 +1858,7 @@
         <w:rPr>
           <w:rFonts w:ascii="Arial" w:hAnsi="Arial" w:cs="Arial"/>
         </w:rPr>
-        <w:t xml:space="preserve">          </w:t>
-      </w:r>
-      <w:proofErr w:type="gramStart"/>
-      <w:r>
-        <w:rPr>
-          <w:rFonts w:ascii="Arial" w:hAnsi="Arial" w:cs="Arial"/>
-        </w:rPr>
-        <w:t>•  {</w:t>
-      </w:r>
-      <w:proofErr w:type="gramEnd"/>
-      <w:r>
-        <w:rPr>
-          <w:rFonts w:ascii="Arial" w:hAnsi="Arial" w:cs="Arial"/>
-        </w:rPr>
-        <w:t>text}{/isDepth</w:t>
-      </w:r>
-      <w:proofErr w:type="gramStart"/>
-      <w:r>
-        <w:rPr>
-          <w:rFonts w:ascii="Arial" w:hAnsi="Arial" w:cs="Arial"/>
-        </w:rPr>
-        <w:t>2}{</w:t>
-      </w:r>
-      <w:proofErr w:type="gramEnd"/>
-      <w:r>
-        <w:rPr>
-          <w:rFonts w:ascii="Arial" w:hAnsi="Arial" w:cs="Arial"/>
-        </w:rPr>
-        <w:t xml:space="preserve">#isDepth3} </w:t>
+        <w:t xml:space="preserve">          •  {text}{/isDepth2}{#isDepth3} </w:t>
       </w:r>
     </w:p>
     <w:p>
@@ -2340,63 +1872,7 @@
         <w:rPr>
           <w:rFonts w:ascii="Arial" w:hAnsi="Arial" w:cs="Arial"/>
         </w:rPr>
-        <w:t xml:space="preserve">               </w:t>
-      </w:r>
-      <w:proofErr w:type="gramStart"/>
-      <w:r>
-        <w:rPr>
-          <w:rFonts w:ascii="Arial" w:hAnsi="Arial" w:cs="Arial"/>
-        </w:rPr>
-        <w:t>•  {</w:t>
-      </w:r>
-      <w:proofErr w:type="gramEnd"/>
-      <w:r>
-        <w:rPr>
-          <w:rFonts w:ascii="Arial" w:hAnsi="Arial" w:cs="Arial"/>
-        </w:rPr>
-        <w:t>text}{/isDepth</w:t>
-      </w:r>
-      <w:proofErr w:type="gramStart"/>
-      <w:r>
-        <w:rPr>
-          <w:rFonts w:ascii="Arial" w:hAnsi="Arial" w:cs="Arial"/>
-        </w:rPr>
-        <w:t>3}{</w:t>
-      </w:r>
-      <w:proofErr w:type="gramEnd"/>
-      <w:r>
-        <w:rPr>
-          <w:rFonts w:ascii="Arial" w:hAnsi="Arial" w:cs="Arial"/>
-        </w:rPr>
-        <w:t>#</w:t>
-      </w:r>
-      <w:proofErr w:type="gramStart"/>
-      <w:r>
-        <w:rPr>
-          <w:rFonts w:ascii="Arial" w:hAnsi="Arial" w:cs="Arial"/>
-        </w:rPr>
-        <w:t>hasNested}{</w:t>
-      </w:r>
-      <w:proofErr w:type="gramEnd"/>
-      <w:r>
-        <w:rPr>
-          <w:rFonts w:ascii="Arial" w:hAnsi="Arial" w:cs="Arial"/>
-        </w:rPr>
-        <w:t>#</w:t>
-      </w:r>
-      <w:proofErr w:type="gramStart"/>
-      <w:r>
-        <w:rPr>
-          <w:rFonts w:ascii="Arial" w:hAnsi="Arial" w:cs="Arial"/>
-        </w:rPr>
-        <w:t>nestedItems}{</w:t>
-      </w:r>
-      <w:proofErr w:type="gramEnd"/>
-      <w:r>
-        <w:rPr>
-          <w:rFonts w:ascii="Arial" w:hAnsi="Arial" w:cs="Arial"/>
-        </w:rPr>
-        <w:t>#isDepth1}</w:t>
+        <w:t xml:space="preserve">               •  {text}{/isDepth3}{#hasNested}{#nestedItems}{#isDepth1}</w:t>
       </w:r>
     </w:p>
     <w:p>
@@ -2411,35 +1887,7 @@
         <w:rPr>
           <w:rFonts w:ascii="Arial" w:hAnsi="Arial" w:cs="Arial"/>
         </w:rPr>
-        <w:t xml:space="preserve">          </w:t>
-      </w:r>
-      <w:proofErr w:type="gramStart"/>
-      <w:r>
-        <w:rPr>
-          <w:rFonts w:ascii="Arial" w:hAnsi="Arial" w:cs="Arial"/>
-        </w:rPr>
-        <w:t>•  {</w:t>
-      </w:r>
-      <w:proofErr w:type="gramEnd"/>
-      <w:r>
-        <w:rPr>
-          <w:rFonts w:ascii="Arial" w:hAnsi="Arial" w:cs="Arial"/>
-        </w:rPr>
-        <w:t>text}{/isDepth</w:t>
-      </w:r>
-      <w:proofErr w:type="gramStart"/>
-      <w:r>
-        <w:rPr>
-          <w:rFonts w:ascii="Arial" w:hAnsi="Arial" w:cs="Arial"/>
-        </w:rPr>
-        <w:t>1}{</w:t>
-      </w:r>
-      <w:proofErr w:type="gramEnd"/>
-      <w:r>
-        <w:rPr>
-          <w:rFonts w:ascii="Arial" w:hAnsi="Arial" w:cs="Arial"/>
-        </w:rPr>
-        <w:t>#isDepth2}</w:t>
+        <w:t xml:space="preserve">          •  {text}{/isDepth1}{#isDepth2}</w:t>
       </w:r>
     </w:p>
     <w:p>
@@ -2454,35 +1902,7 @@
         <w:rPr>
           <w:rFonts w:ascii="Arial" w:hAnsi="Arial" w:cs="Arial"/>
         </w:rPr>
-        <w:t xml:space="preserve">                     </w:t>
-      </w:r>
-      <w:proofErr w:type="gramStart"/>
-      <w:r>
-        <w:rPr>
-          <w:rFonts w:ascii="Arial" w:hAnsi="Arial" w:cs="Arial"/>
-        </w:rPr>
-        <w:t>•  {</w:t>
-      </w:r>
-      <w:proofErr w:type="gramEnd"/>
-      <w:r>
-        <w:rPr>
-          <w:rFonts w:ascii="Arial" w:hAnsi="Arial" w:cs="Arial"/>
-        </w:rPr>
-        <w:t>text}{/isDepth</w:t>
-      </w:r>
-      <w:proofErr w:type="gramStart"/>
-      <w:r>
-        <w:rPr>
-          <w:rFonts w:ascii="Arial" w:hAnsi="Arial" w:cs="Arial"/>
-        </w:rPr>
-        <w:t>2}{</w:t>
-      </w:r>
-      <w:proofErr w:type="gramEnd"/>
-      <w:r>
-        <w:rPr>
-          <w:rFonts w:ascii="Arial" w:hAnsi="Arial" w:cs="Arial"/>
-        </w:rPr>
-        <w:t>#isDepth3}</w:t>
+        <w:t xml:space="preserve">                     •  {text}{/isDepth2}{#isDepth3}</w:t>
       </w:r>
     </w:p>
     <w:p>
@@ -2497,63 +1917,7 @@
         <w:rPr>
           <w:rFonts w:ascii="Arial" w:hAnsi="Arial" w:cs="Arial"/>
         </w:rPr>
-        <w:t xml:space="preserve">               </w:t>
-      </w:r>
-      <w:proofErr w:type="gramStart"/>
-      <w:r>
-        <w:rPr>
-          <w:rFonts w:ascii="Arial" w:hAnsi="Arial" w:cs="Arial"/>
-        </w:rPr>
-        <w:t>•  {</w:t>
-      </w:r>
-      <w:proofErr w:type="gramEnd"/>
-      <w:r>
-        <w:rPr>
-          <w:rFonts w:ascii="Arial" w:hAnsi="Arial" w:cs="Arial"/>
-        </w:rPr>
-        <w:t>text}{/isDepth</w:t>
-      </w:r>
-      <w:proofErr w:type="gramStart"/>
-      <w:r>
-        <w:rPr>
-          <w:rFonts w:ascii="Arial" w:hAnsi="Arial" w:cs="Arial"/>
-        </w:rPr>
-        <w:t>3}{</w:t>
-      </w:r>
-      <w:proofErr w:type="gramEnd"/>
-      <w:r>
-        <w:rPr>
-          <w:rFonts w:ascii="Arial" w:hAnsi="Arial" w:cs="Arial"/>
-        </w:rPr>
-        <w:t>#</w:t>
-      </w:r>
-      <w:proofErr w:type="gramStart"/>
-      <w:r>
-        <w:rPr>
-          <w:rFonts w:ascii="Arial" w:hAnsi="Arial" w:cs="Arial"/>
-        </w:rPr>
-        <w:t>hasNested}{</w:t>
-      </w:r>
-      <w:proofErr w:type="gramEnd"/>
-      <w:r>
-        <w:rPr>
-          <w:rFonts w:ascii="Arial" w:hAnsi="Arial" w:cs="Arial"/>
-        </w:rPr>
-        <w:t>#</w:t>
-      </w:r>
-      <w:proofErr w:type="gramStart"/>
-      <w:r>
-        <w:rPr>
-          <w:rFonts w:ascii="Arial" w:hAnsi="Arial" w:cs="Arial"/>
-        </w:rPr>
-        <w:t>nestedItems}{</w:t>
-      </w:r>
-      <w:proofErr w:type="gramEnd"/>
-      <w:r>
-        <w:rPr>
-          <w:rFonts w:ascii="Arial" w:hAnsi="Arial" w:cs="Arial"/>
-        </w:rPr>
-        <w:t>#isDepth2}</w:t>
+        <w:t xml:space="preserve">               •  {text}{/isDepth3}{#hasNested}{#nestedItems}{#isDepth2}</w:t>
       </w:r>
     </w:p>
     <w:p>
@@ -2568,35 +1932,7 @@
         <w:rPr>
           <w:rFonts w:ascii="Arial" w:hAnsi="Arial" w:cs="Arial"/>
         </w:rPr>
-        <w:t xml:space="preserve">                  </w:t>
-      </w:r>
-      <w:proofErr w:type="gramStart"/>
-      <w:r>
-        <w:rPr>
-          <w:rFonts w:ascii="Arial" w:hAnsi="Arial" w:cs="Arial"/>
-        </w:rPr>
-        <w:t>•  {</w:t>
-      </w:r>
-      <w:proofErr w:type="gramEnd"/>
-      <w:r>
-        <w:rPr>
-          <w:rFonts w:ascii="Arial" w:hAnsi="Arial" w:cs="Arial"/>
-        </w:rPr>
-        <w:t>text}{/isDepth</w:t>
-      </w:r>
-      <w:proofErr w:type="gramStart"/>
-      <w:r>
-        <w:rPr>
-          <w:rFonts w:ascii="Arial" w:hAnsi="Arial" w:cs="Arial"/>
-        </w:rPr>
-        <w:t>2}{</w:t>
-      </w:r>
-      <w:proofErr w:type="gramEnd"/>
-      <w:r>
-        <w:rPr>
-          <w:rFonts w:ascii="Arial" w:hAnsi="Arial" w:cs="Arial"/>
-        </w:rPr>
-        <w:t>#isDepth3}</w:t>
+        <w:t xml:space="preserve">                  •  {text}{/isDepth2}{#isDepth3}</w:t>
       </w:r>
     </w:p>
     <w:p>
@@ -2610,63 +1946,7 @@
         <w:rPr>
           <w:rFonts w:ascii="Arial" w:hAnsi="Arial" w:cs="Arial"/>
         </w:rPr>
-        <w:t xml:space="preserve">                  </w:t>
-      </w:r>
-      <w:proofErr w:type="gramStart"/>
-      <w:r>
-        <w:rPr>
-          <w:rFonts w:ascii="Arial" w:hAnsi="Arial" w:cs="Arial"/>
-        </w:rPr>
-        <w:t>•  {</w:t>
-      </w:r>
-      <w:proofErr w:type="gramEnd"/>
-      <w:r>
-        <w:rPr>
-          <w:rFonts w:ascii="Arial" w:hAnsi="Arial" w:cs="Arial"/>
-        </w:rPr>
-        <w:t>text}{/isDepth</w:t>
-      </w:r>
-      <w:proofErr w:type="gramStart"/>
-      <w:r>
-        <w:rPr>
-          <w:rFonts w:ascii="Arial" w:hAnsi="Arial" w:cs="Arial"/>
-        </w:rPr>
-        <w:t>3}{</w:t>
-      </w:r>
-      <w:proofErr w:type="gramEnd"/>
-      <w:r>
-        <w:rPr>
-          <w:rFonts w:ascii="Arial" w:hAnsi="Arial" w:cs="Arial"/>
-        </w:rPr>
-        <w:t>#</w:t>
-      </w:r>
-      <w:proofErr w:type="gramStart"/>
-      <w:r>
-        <w:rPr>
-          <w:rFonts w:ascii="Arial" w:hAnsi="Arial" w:cs="Arial"/>
-        </w:rPr>
-        <w:t>hasNested}{</w:t>
-      </w:r>
-      <w:proofErr w:type="gramEnd"/>
-      <w:r>
-        <w:rPr>
-          <w:rFonts w:ascii="Arial" w:hAnsi="Arial" w:cs="Arial"/>
-        </w:rPr>
-        <w:t>#</w:t>
-      </w:r>
-      <w:proofErr w:type="gramStart"/>
-      <w:r>
-        <w:rPr>
-          <w:rFonts w:ascii="Arial" w:hAnsi="Arial" w:cs="Arial"/>
-        </w:rPr>
-        <w:t>nestedItems}{</w:t>
-      </w:r>
-      <w:proofErr w:type="gramEnd"/>
-      <w:r>
-        <w:rPr>
-          <w:rFonts w:ascii="Arial" w:hAnsi="Arial" w:cs="Arial"/>
-        </w:rPr>
-        <w:t>#isDepth3}</w:t>
+        <w:t xml:space="preserve">                  •  {text}{/isDepth3}{#hasNested}{#nestedItems}{#isDepth3}</w:t>
       </w:r>
     </w:p>
     <w:p>
@@ -2680,77 +1960,7 @@
         <w:rPr>
           <w:rFonts w:ascii="Arial" w:hAnsi="Arial" w:cs="Arial"/>
         </w:rPr>
-        <w:t xml:space="preserve"> • {text}{/isDepth</w:t>
-      </w:r>
-      <w:proofErr w:type="gramStart"/>
-      <w:r>
-        <w:rPr>
-          <w:rFonts w:ascii="Arial" w:hAnsi="Arial" w:cs="Arial"/>
-        </w:rPr>
-        <w:t>3}{</w:t>
-      </w:r>
-      <w:proofErr w:type="gramEnd"/>
-      <w:r>
-        <w:rPr>
-          <w:rFonts w:ascii="Arial" w:hAnsi="Arial" w:cs="Arial"/>
-        </w:rPr>
-        <w:t>/</w:t>
-      </w:r>
-      <w:proofErr w:type="gramStart"/>
-      <w:r>
-        <w:rPr>
-          <w:rFonts w:ascii="Arial" w:hAnsi="Arial" w:cs="Arial"/>
-        </w:rPr>
-        <w:t>nestedItems}{</w:t>
-      </w:r>
-      <w:proofErr w:type="gramEnd"/>
-      <w:r>
-        <w:rPr>
-          <w:rFonts w:ascii="Arial" w:hAnsi="Arial" w:cs="Arial"/>
-        </w:rPr>
-        <w:t>/</w:t>
-      </w:r>
-      <w:proofErr w:type="gramStart"/>
-      <w:r>
-        <w:rPr>
-          <w:rFonts w:ascii="Arial" w:hAnsi="Arial" w:cs="Arial"/>
-        </w:rPr>
-        <w:t>hasNested}{</w:t>
-      </w:r>
-      <w:proofErr w:type="gramEnd"/>
-      <w:r>
-        <w:rPr>
-          <w:rFonts w:ascii="Arial" w:hAnsi="Arial" w:cs="Arial"/>
-        </w:rPr>
-        <w:t>/</w:t>
-      </w:r>
-      <w:proofErr w:type="gramStart"/>
-      <w:r>
-        <w:rPr>
-          <w:rFonts w:ascii="Arial" w:hAnsi="Arial" w:cs="Arial"/>
-        </w:rPr>
-        <w:t>nestedItems}{</w:t>
-      </w:r>
-      <w:proofErr w:type="gramEnd"/>
-      <w:r>
-        <w:rPr>
-          <w:rFonts w:ascii="Arial" w:hAnsi="Arial" w:cs="Arial"/>
-        </w:rPr>
-        <w:t>/</w:t>
-      </w:r>
-      <w:proofErr w:type="gramStart"/>
-      <w:r>
-        <w:rPr>
-          <w:rFonts w:ascii="Arial" w:hAnsi="Arial" w:cs="Arial"/>
-        </w:rPr>
-        <w:t>hasNested}{</w:t>
-      </w:r>
-      <w:proofErr w:type="gramEnd"/>
-      <w:r>
-        <w:rPr>
-          <w:rFonts w:ascii="Arial" w:hAnsi="Arial" w:cs="Arial"/>
-        </w:rPr>
-        <w:t>/nestedItems}</w:t>
+        <w:t xml:space="preserve"> • {text}{/isDepth3}{/nestedItems}{/hasNested}{/nestedItems}{/hasNested}{/nestedItems}</w:t>
       </w:r>
       <w:r>
         <w:rPr>
@@ -2765,7 +1975,6 @@
         <w:t>{/</w:t>
       </w:r>
       <w:proofErr w:type="spellStart"/>
-      <w:proofErr w:type="gramStart"/>
       <w:r>
         <w:rPr>
           <w:rFonts w:ascii="Arial" w:hAnsi="Arial" w:cs="Arial"/>
@@ -2777,14 +1986,7 @@
         <w:rPr>
           <w:rFonts w:ascii="Arial" w:hAnsi="Arial" w:cs="Arial"/>
         </w:rPr>
-        <w:t>}{</w:t>
-      </w:r>
-      <w:proofErr w:type="gramEnd"/>
-      <w:r>
-        <w:rPr>
-          <w:rFonts w:ascii="Arial" w:hAnsi="Arial" w:cs="Arial"/>
-        </w:rPr>
-        <w:t>/items}</w:t>
+        <w:t>}{/items}</w:t>
       </w:r>
     </w:p>
     <w:p>
@@ -2801,7 +2003,6 @@
         <w:t>{/</w:t>
       </w:r>
       <w:proofErr w:type="spellStart"/>
-      <w:proofErr w:type="gramStart"/>
       <w:r>
         <w:rPr>
           <w:rFonts w:ascii="Arial" w:hAnsi="Arial" w:cs="Arial"/>
@@ -2813,17 +2014,9 @@
         <w:rPr>
           <w:rFonts w:ascii="Arial" w:hAnsi="Arial" w:cs="Arial"/>
         </w:rPr>
-        <w:t>}{</w:t>
-      </w:r>
-      <w:proofErr w:type="gramEnd"/>
-      <w:r>
-        <w:rPr>
-          <w:rFonts w:ascii="Arial" w:hAnsi="Arial" w:cs="Arial"/>
-        </w:rPr>
-        <w:t>/</w:t>
+        <w:t>}{/</w:t>
       </w:r>
       <w:proofErr w:type="spellStart"/>
-      <w:proofErr w:type="gramStart"/>
       <w:r>
         <w:rPr>
           <w:rFonts w:ascii="Arial" w:hAnsi="Arial" w:cs="Arial"/>
@@ -2835,42 +2028,7 @@
         <w:rPr>
           <w:rFonts w:ascii="Arial" w:hAnsi="Arial" w:cs="Arial"/>
         </w:rPr>
-        <w:t>}{</w:t>
-      </w:r>
-      <w:proofErr w:type="gramEnd"/>
-      <w:r>
-        <w:rPr>
-          <w:rFonts w:ascii="Arial" w:hAnsi="Arial" w:cs="Arial"/>
-        </w:rPr>
-        <w:t>#</w:t>
-      </w:r>
-      <w:proofErr w:type="gramStart"/>
-      <w:r>
-        <w:rPr>
-          <w:rFonts w:ascii="Arial" w:hAnsi="Arial" w:cs="Arial"/>
-        </w:rPr>
-        <w:t>isTable}{</w:t>
-      </w:r>
-      <w:proofErr w:type="gramEnd"/>
-      <w:r>
-        <w:rPr>
-          <w:rFonts w:ascii="Arial" w:hAnsi="Arial" w:cs="Arial"/>
-        </w:rPr>
-        <w:t>^</w:t>
-      </w:r>
-      <w:proofErr w:type="gramStart"/>
-      <w:r>
-        <w:rPr>
-          <w:rFonts w:ascii="Arial" w:hAnsi="Arial" w:cs="Arial"/>
-        </w:rPr>
-        <w:t>isAttachment}{</w:t>
-      </w:r>
-      <w:proofErr w:type="gramEnd"/>
-      <w:r>
-        <w:rPr>
-          <w:rFonts w:ascii="Arial" w:hAnsi="Arial" w:cs="Arial"/>
-        </w:rPr>
-        <w:t>#is1Col}</w:t>
+        <w:t>}{#isTable}{^isAttachment}{#is1Col}</w:t>
       </w:r>
     </w:p>
     <w:tbl>
@@ -2903,35 +2061,7 @@
               <w:rPr>
                 <w:rFonts w:ascii="Arial" w:hAnsi="Arial" w:cs="Arial"/>
               </w:rPr>
-              <w:t>{#</w:t>
-            </w:r>
-            <w:proofErr w:type="gramStart"/>
-            <w:r>
-              <w:rPr>
-                <w:rFonts w:ascii="Arial" w:hAnsi="Arial" w:cs="Arial"/>
-              </w:rPr>
-              <w:t>header}{</w:t>
-            </w:r>
-            <w:proofErr w:type="gramEnd"/>
-            <w:r>
-              <w:rPr>
-                <w:rFonts w:ascii="Arial" w:hAnsi="Arial" w:cs="Arial"/>
-              </w:rPr>
-              <w:t>col</w:t>
-            </w:r>
-            <w:proofErr w:type="gramStart"/>
-            <w:r>
-              <w:rPr>
-                <w:rFonts w:ascii="Arial" w:hAnsi="Arial" w:cs="Arial"/>
-              </w:rPr>
-              <w:t>0}{</w:t>
-            </w:r>
-            <w:proofErr w:type="gramEnd"/>
-            <w:r>
-              <w:rPr>
-                <w:rFonts w:ascii="Arial" w:hAnsi="Arial" w:cs="Arial"/>
-              </w:rPr>
-              <w:t>/header}</w:t>
+              <w:t>{#header}{col0}{/header}</w:t>
             </w:r>
           </w:p>
         </w:tc>
@@ -3014,21 +2144,7 @@
         <w:rPr>
           <w:rFonts w:ascii="Arial" w:hAnsi="Arial" w:cs="Arial"/>
         </w:rPr>
-        <w:t>{/is1</w:t>
-      </w:r>
-      <w:proofErr w:type="gramStart"/>
-      <w:r>
-        <w:rPr>
-          <w:rFonts w:ascii="Arial" w:hAnsi="Arial" w:cs="Arial"/>
-        </w:rPr>
-        <w:t>Col}{</w:t>
-      </w:r>
-      <w:proofErr w:type="gramEnd"/>
-      <w:r>
-        <w:rPr>
-          <w:rFonts w:ascii="Arial" w:hAnsi="Arial" w:cs="Arial"/>
-        </w:rPr>
-        <w:t>#is2Col}</w:t>
+        <w:t>{/is1Col}{#is2Col}</w:t>
       </w:r>
     </w:p>
     <w:tbl>
@@ -3063,21 +2179,7 @@
               <w:rPr>
                 <w:rFonts w:ascii="Arial" w:hAnsi="Arial" w:cs="Arial"/>
               </w:rPr>
-              <w:t>{#</w:t>
-            </w:r>
-            <w:proofErr w:type="gramStart"/>
-            <w:r>
-              <w:rPr>
-                <w:rFonts w:ascii="Arial" w:hAnsi="Arial" w:cs="Arial"/>
-              </w:rPr>
-              <w:t>header}{</w:t>
-            </w:r>
-            <w:proofErr w:type="gramEnd"/>
-            <w:r>
-              <w:rPr>
-                <w:rFonts w:ascii="Arial" w:hAnsi="Arial" w:cs="Arial"/>
-              </w:rPr>
-              <w:t>col0}</w:t>
+              <w:t>{#header}{col0}</w:t>
             </w:r>
           </w:p>
         </w:tc>
@@ -3097,21 +2199,7 @@
               <w:rPr>
                 <w:rFonts w:ascii="Arial" w:hAnsi="Arial" w:cs="Arial"/>
               </w:rPr>
-              <w:t>{col</w:t>
-            </w:r>
-            <w:proofErr w:type="gramStart"/>
-            <w:r>
-              <w:rPr>
-                <w:rFonts w:ascii="Arial" w:hAnsi="Arial" w:cs="Arial"/>
-              </w:rPr>
-              <w:t>1}{</w:t>
-            </w:r>
-            <w:proofErr w:type="gramEnd"/>
-            <w:r>
-              <w:rPr>
-                <w:rFonts w:ascii="Arial" w:hAnsi="Arial" w:cs="Arial"/>
-              </w:rPr>
-              <w:t>/header}</w:t>
+              <w:t>{col1}{/header}</w:t>
             </w:r>
           </w:p>
         </w:tc>
@@ -3137,21 +2225,7 @@
               <w:rPr>
                 <w:rFonts w:ascii="Arial" w:hAnsi="Arial" w:cs="Arial"/>
               </w:rPr>
-              <w:t>{#</w:t>
-            </w:r>
-            <w:proofErr w:type="gramStart"/>
-            <w:r>
-              <w:rPr>
-                <w:rFonts w:ascii="Arial" w:hAnsi="Arial" w:cs="Arial"/>
-              </w:rPr>
-              <w:t>rows}{</w:t>
-            </w:r>
-            <w:proofErr w:type="gramEnd"/>
-            <w:r>
-              <w:rPr>
-                <w:rFonts w:ascii="Arial" w:hAnsi="Arial" w:cs="Arial"/>
-              </w:rPr>
-              <w:t>col0}</w:t>
+              <w:t>{#rows}{col0}</w:t>
             </w:r>
           </w:p>
         </w:tc>
@@ -3171,21 +2245,7 @@
               <w:rPr>
                 <w:rFonts w:ascii="Arial" w:hAnsi="Arial" w:cs="Arial"/>
               </w:rPr>
-              <w:t>{col</w:t>
-            </w:r>
-            <w:proofErr w:type="gramStart"/>
-            <w:r>
-              <w:rPr>
-                <w:rFonts w:ascii="Arial" w:hAnsi="Arial" w:cs="Arial"/>
-              </w:rPr>
-              <w:t>1}{</w:t>
-            </w:r>
-            <w:proofErr w:type="gramEnd"/>
-            <w:r>
-              <w:rPr>
-                <w:rFonts w:ascii="Arial" w:hAnsi="Arial" w:cs="Arial"/>
-              </w:rPr>
-              <w:t>/rows}</w:t>
+              <w:t>{col1}{/rows}</w:t>
             </w:r>
           </w:p>
         </w:tc>
@@ -3202,21 +2262,7 @@
         <w:rPr>
           <w:rFonts w:ascii="Arial" w:hAnsi="Arial" w:cs="Arial"/>
         </w:rPr>
-        <w:t>{/is2</w:t>
-      </w:r>
-      <w:proofErr w:type="gramStart"/>
-      <w:r>
-        <w:rPr>
-          <w:rFonts w:ascii="Arial" w:hAnsi="Arial" w:cs="Arial"/>
-        </w:rPr>
-        <w:t>Col}{</w:t>
-      </w:r>
-      <w:proofErr w:type="gramEnd"/>
-      <w:r>
-        <w:rPr>
-          <w:rFonts w:ascii="Arial" w:hAnsi="Arial" w:cs="Arial"/>
-        </w:rPr>
-        <w:t>#is3Col}</w:t>
+        <w:t>{/is2Col}{#is3Col}</w:t>
       </w:r>
     </w:p>
     <w:tbl>
@@ -3251,21 +2297,7 @@
               <w:rPr>
                 <w:rFonts w:ascii="Arial" w:hAnsi="Arial" w:cs="Arial"/>
               </w:rPr>
-              <w:t>{#</w:t>
-            </w:r>
-            <w:proofErr w:type="gramStart"/>
-            <w:r>
-              <w:rPr>
-                <w:rFonts w:ascii="Arial" w:hAnsi="Arial" w:cs="Arial"/>
-              </w:rPr>
-              <w:t>header}{</w:t>
-            </w:r>
-            <w:proofErr w:type="gramEnd"/>
-            <w:r>
-              <w:rPr>
-                <w:rFonts w:ascii="Arial" w:hAnsi="Arial" w:cs="Arial"/>
-              </w:rPr>
-              <w:t>col0}</w:t>
+              <w:t>{#header}{col0}</w:t>
             </w:r>
           </w:p>
         </w:tc>
@@ -3305,21 +2337,7 @@
               <w:rPr>
                 <w:rFonts w:ascii="Arial" w:hAnsi="Arial" w:cs="Arial"/>
               </w:rPr>
-              <w:t>{col</w:t>
-            </w:r>
-            <w:proofErr w:type="gramStart"/>
-            <w:r>
-              <w:rPr>
-                <w:rFonts w:ascii="Arial" w:hAnsi="Arial" w:cs="Arial"/>
-              </w:rPr>
-              <w:t>2}{</w:t>
-            </w:r>
-            <w:proofErr w:type="gramEnd"/>
-            <w:r>
-              <w:rPr>
-                <w:rFonts w:ascii="Arial" w:hAnsi="Arial" w:cs="Arial"/>
-              </w:rPr>
-              <w:t>/header}</w:t>
+              <w:t>{col2}{/header}</w:t>
             </w:r>
           </w:p>
         </w:tc>
@@ -3344,21 +2362,7 @@
               <w:rPr>
                 <w:rFonts w:ascii="Arial" w:hAnsi="Arial" w:cs="Arial"/>
               </w:rPr>
-              <w:t>{#</w:t>
-            </w:r>
-            <w:proofErr w:type="gramStart"/>
-            <w:r>
-              <w:rPr>
-                <w:rFonts w:ascii="Arial" w:hAnsi="Arial" w:cs="Arial"/>
-              </w:rPr>
-              <w:t>rows}{</w:t>
-            </w:r>
-            <w:proofErr w:type="gramEnd"/>
-            <w:r>
-              <w:rPr>
-                <w:rFonts w:ascii="Arial" w:hAnsi="Arial" w:cs="Arial"/>
-              </w:rPr>
-              <w:t>col0}</w:t>
+              <w:t>{#rows}{col0}</w:t>
             </w:r>
           </w:p>
         </w:tc>
@@ -3398,21 +2402,7 @@
               <w:rPr>
                 <w:rFonts w:ascii="Arial" w:hAnsi="Arial" w:cs="Arial"/>
               </w:rPr>
-              <w:t>{col</w:t>
-            </w:r>
-            <w:proofErr w:type="gramStart"/>
-            <w:r>
-              <w:rPr>
-                <w:rFonts w:ascii="Arial" w:hAnsi="Arial" w:cs="Arial"/>
-              </w:rPr>
-              <w:t>2}{</w:t>
-            </w:r>
-            <w:proofErr w:type="gramEnd"/>
-            <w:r>
-              <w:rPr>
-                <w:rFonts w:ascii="Arial" w:hAnsi="Arial" w:cs="Arial"/>
-              </w:rPr>
-              <w:t>/rows}</w:t>
+              <w:t>{col2}{/rows}</w:t>
             </w:r>
           </w:p>
         </w:tc>
@@ -3429,21 +2419,7 @@
         <w:rPr>
           <w:rFonts w:ascii="Arial" w:hAnsi="Arial" w:cs="Arial"/>
         </w:rPr>
-        <w:t>{/is3</w:t>
-      </w:r>
-      <w:proofErr w:type="gramStart"/>
-      <w:r>
-        <w:rPr>
-          <w:rFonts w:ascii="Arial" w:hAnsi="Arial" w:cs="Arial"/>
-        </w:rPr>
-        <w:t>Col}{</w:t>
-      </w:r>
-      <w:proofErr w:type="gramEnd"/>
-      <w:r>
-        <w:rPr>
-          <w:rFonts w:ascii="Arial" w:hAnsi="Arial" w:cs="Arial"/>
-        </w:rPr>
-        <w:t>#is4Col}</w:t>
+        <w:t>{/is3Col}{#is4Col}</w:t>
       </w:r>
     </w:p>
     <w:tbl>
@@ -3479,21 +2455,7 @@
               <w:rPr>
                 <w:rFonts w:ascii="Arial" w:hAnsi="Arial" w:cs="Arial"/>
               </w:rPr>
-              <w:t>{#</w:t>
-            </w:r>
-            <w:proofErr w:type="gramStart"/>
-            <w:r>
-              <w:rPr>
-                <w:rFonts w:ascii="Arial" w:hAnsi="Arial" w:cs="Arial"/>
-              </w:rPr>
-              <w:t>header}{</w:t>
-            </w:r>
-            <w:proofErr w:type="gramEnd"/>
-            <w:r>
-              <w:rPr>
-                <w:rFonts w:ascii="Arial" w:hAnsi="Arial" w:cs="Arial"/>
-              </w:rPr>
-              <w:t>col0}</w:t>
+              <w:t>{#header}{col0}</w:t>
             </w:r>
           </w:p>
         </w:tc>
@@ -3553,21 +2515,7 @@
               <w:rPr>
                 <w:rFonts w:ascii="Arial" w:hAnsi="Arial" w:cs="Arial"/>
               </w:rPr>
-              <w:t>{col</w:t>
-            </w:r>
-            <w:proofErr w:type="gramStart"/>
-            <w:r>
-              <w:rPr>
-                <w:rFonts w:ascii="Arial" w:hAnsi="Arial" w:cs="Arial"/>
-              </w:rPr>
-              <w:t>3}{</w:t>
-            </w:r>
-            <w:proofErr w:type="gramEnd"/>
-            <w:r>
-              <w:rPr>
-                <w:rFonts w:ascii="Arial" w:hAnsi="Arial" w:cs="Arial"/>
-              </w:rPr>
-              <w:t>/header}</w:t>
+              <w:t>{col3}{/header}</w:t>
             </w:r>
           </w:p>
         </w:tc>
@@ -3593,21 +2541,7 @@
                 <w:rFonts w:ascii="Arial" w:hAnsi="Arial" w:cs="Arial"/>
               </w:rPr>
               <w:lastRenderedPageBreak/>
-              <w:t>{#</w:t>
-            </w:r>
-            <w:proofErr w:type="gramStart"/>
-            <w:r>
-              <w:rPr>
-                <w:rFonts w:ascii="Arial" w:hAnsi="Arial" w:cs="Arial"/>
-              </w:rPr>
-              <w:t>rows}{</w:t>
-            </w:r>
-            <w:proofErr w:type="gramEnd"/>
-            <w:r>
-              <w:rPr>
-                <w:rFonts w:ascii="Arial" w:hAnsi="Arial" w:cs="Arial"/>
-              </w:rPr>
-              <w:t>col0}</w:t>
+              <w:t>{#rows}{col0}</w:t>
             </w:r>
           </w:p>
         </w:tc>
@@ -3667,21 +2601,7 @@
               <w:rPr>
                 <w:rFonts w:ascii="Arial" w:hAnsi="Arial" w:cs="Arial"/>
               </w:rPr>
-              <w:t>{col</w:t>
-            </w:r>
-            <w:proofErr w:type="gramStart"/>
-            <w:r>
-              <w:rPr>
-                <w:rFonts w:ascii="Arial" w:hAnsi="Arial" w:cs="Arial"/>
-              </w:rPr>
-              <w:t>3}{</w:t>
-            </w:r>
-            <w:proofErr w:type="gramEnd"/>
-            <w:r>
-              <w:rPr>
-                <w:rFonts w:ascii="Arial" w:hAnsi="Arial" w:cs="Arial"/>
-              </w:rPr>
-              <w:t>/rows}</w:t>
+              <w:t>{col3}{/rows}</w:t>
             </w:r>
           </w:p>
         </w:tc>
@@ -3698,21 +2618,7 @@
         <w:rPr>
           <w:rFonts w:ascii="Arial" w:hAnsi="Arial" w:cs="Arial"/>
         </w:rPr>
-        <w:t>{/is4</w:t>
-      </w:r>
-      <w:proofErr w:type="gramStart"/>
-      <w:r>
-        <w:rPr>
-          <w:rFonts w:ascii="Arial" w:hAnsi="Arial" w:cs="Arial"/>
-        </w:rPr>
-        <w:t>Col}{</w:t>
-      </w:r>
-      <w:proofErr w:type="gramEnd"/>
-      <w:r>
-        <w:rPr>
-          <w:rFonts w:ascii="Arial" w:hAnsi="Arial" w:cs="Arial"/>
-        </w:rPr>
-        <w:t>#is5Col}</w:t>
+        <w:t>{/is4Col}{#is5Col}</w:t>
       </w:r>
     </w:p>
     <w:tbl>
@@ -3749,21 +2655,7 @@
               <w:rPr>
                 <w:rFonts w:ascii="Arial" w:hAnsi="Arial" w:cs="Arial"/>
               </w:rPr>
-              <w:t>{#</w:t>
-            </w:r>
-            <w:proofErr w:type="gramStart"/>
-            <w:r>
-              <w:rPr>
-                <w:rFonts w:ascii="Arial" w:hAnsi="Arial" w:cs="Arial"/>
-              </w:rPr>
-              <w:t>header}{</w:t>
-            </w:r>
-            <w:proofErr w:type="gramEnd"/>
-            <w:r>
-              <w:rPr>
-                <w:rFonts w:ascii="Arial" w:hAnsi="Arial" w:cs="Arial"/>
-              </w:rPr>
-              <w:t>col0}</w:t>
+              <w:t>{#header}{col0}</w:t>
             </w:r>
           </w:p>
         </w:tc>
@@ -3843,21 +2735,7 @@
               <w:rPr>
                 <w:rFonts w:ascii="Arial" w:hAnsi="Arial" w:cs="Arial"/>
               </w:rPr>
-              <w:t>{col</w:t>
-            </w:r>
-            <w:proofErr w:type="gramStart"/>
-            <w:r>
-              <w:rPr>
-                <w:rFonts w:ascii="Arial" w:hAnsi="Arial" w:cs="Arial"/>
-              </w:rPr>
-              <w:t>4}{</w:t>
-            </w:r>
-            <w:proofErr w:type="gramEnd"/>
-            <w:r>
-              <w:rPr>
-                <w:rFonts w:ascii="Arial" w:hAnsi="Arial" w:cs="Arial"/>
-              </w:rPr>
-              <w:t>/header}</w:t>
+              <w:t>{col4}{/header}</w:t>
             </w:r>
           </w:p>
         </w:tc>
@@ -3882,21 +2760,7 @@
               <w:rPr>
                 <w:rFonts w:ascii="Arial" w:hAnsi="Arial" w:cs="Arial"/>
               </w:rPr>
-              <w:t>{#</w:t>
-            </w:r>
-            <w:proofErr w:type="gramStart"/>
-            <w:r>
-              <w:rPr>
-                <w:rFonts w:ascii="Arial" w:hAnsi="Arial" w:cs="Arial"/>
-              </w:rPr>
-              <w:t>rows}{</w:t>
-            </w:r>
-            <w:proofErr w:type="gramEnd"/>
-            <w:r>
-              <w:rPr>
-                <w:rFonts w:ascii="Arial" w:hAnsi="Arial" w:cs="Arial"/>
-              </w:rPr>
-              <w:t>col0}</w:t>
+              <w:t>{#rows}{col0}</w:t>
             </w:r>
           </w:p>
         </w:tc>
@@ -3976,21 +2840,7 @@
               <w:rPr>
                 <w:rFonts w:ascii="Arial" w:hAnsi="Arial" w:cs="Arial"/>
               </w:rPr>
-              <w:t>{col</w:t>
-            </w:r>
-            <w:proofErr w:type="gramStart"/>
-            <w:r>
-              <w:rPr>
-                <w:rFonts w:ascii="Arial" w:hAnsi="Arial" w:cs="Arial"/>
-              </w:rPr>
-              <w:t>4}{</w:t>
-            </w:r>
-            <w:proofErr w:type="gramEnd"/>
-            <w:r>
-              <w:rPr>
-                <w:rFonts w:ascii="Arial" w:hAnsi="Arial" w:cs="Arial"/>
-              </w:rPr>
-              <w:t>/rows}</w:t>
+              <w:t>{col4}{/rows}</w:t>
             </w:r>
           </w:p>
         </w:tc>
@@ -4007,21 +2857,7 @@
         <w:rPr>
           <w:rFonts w:ascii="Arial" w:hAnsi="Arial" w:cs="Arial"/>
         </w:rPr>
-        <w:t>{/is5</w:t>
-      </w:r>
-      <w:proofErr w:type="gramStart"/>
-      <w:r>
-        <w:rPr>
-          <w:rFonts w:ascii="Arial" w:hAnsi="Arial" w:cs="Arial"/>
-        </w:rPr>
-        <w:t>Col}{</w:t>
-      </w:r>
-      <w:proofErr w:type="gramEnd"/>
-      <w:r>
-        <w:rPr>
-          <w:rFonts w:ascii="Arial" w:hAnsi="Arial" w:cs="Arial"/>
-        </w:rPr>
-        <w:t>#is6Col}</w:t>
+        <w:t>{/is5Col}{#is6Col}</w:t>
       </w:r>
     </w:p>
     <w:tbl>
@@ -4059,21 +2895,7 @@
               <w:rPr>
                 <w:rFonts w:ascii="Arial" w:hAnsi="Arial" w:cs="Arial"/>
               </w:rPr>
-              <w:t>{#</w:t>
-            </w:r>
-            <w:proofErr w:type="gramStart"/>
-            <w:r>
-              <w:rPr>
-                <w:rFonts w:ascii="Arial" w:hAnsi="Arial" w:cs="Arial"/>
-              </w:rPr>
-              <w:t>header}{</w:t>
-            </w:r>
-            <w:proofErr w:type="gramEnd"/>
-            <w:r>
-              <w:rPr>
-                <w:rFonts w:ascii="Arial" w:hAnsi="Arial" w:cs="Arial"/>
-              </w:rPr>
-              <w:t>col0}</w:t>
+              <w:t>{#header}{col0}</w:t>
             </w:r>
           </w:p>
         </w:tc>
@@ -4173,21 +2995,7 @@
               <w:rPr>
                 <w:rFonts w:ascii="Arial" w:hAnsi="Arial" w:cs="Arial"/>
               </w:rPr>
-              <w:t>{col</w:t>
-            </w:r>
-            <w:proofErr w:type="gramStart"/>
-            <w:r>
-              <w:rPr>
-                <w:rFonts w:ascii="Arial" w:hAnsi="Arial" w:cs="Arial"/>
-              </w:rPr>
-              <w:t>5}{</w:t>
-            </w:r>
-            <w:proofErr w:type="gramEnd"/>
-            <w:r>
-              <w:rPr>
-                <w:rFonts w:ascii="Arial" w:hAnsi="Arial" w:cs="Arial"/>
-              </w:rPr>
-              <w:t>/header}</w:t>
+              <w:t>{col5}{/header}</w:t>
             </w:r>
           </w:p>
         </w:tc>
@@ -4212,21 +3020,7 @@
               <w:rPr>
                 <w:rFonts w:ascii="Arial" w:hAnsi="Arial" w:cs="Arial"/>
               </w:rPr>
-              <w:t>{#</w:t>
-            </w:r>
-            <w:proofErr w:type="gramStart"/>
-            <w:r>
-              <w:rPr>
-                <w:rFonts w:ascii="Arial" w:hAnsi="Arial" w:cs="Arial"/>
-              </w:rPr>
-              <w:t>rows}{</w:t>
-            </w:r>
-            <w:proofErr w:type="gramEnd"/>
-            <w:r>
-              <w:rPr>
-                <w:rFonts w:ascii="Arial" w:hAnsi="Arial" w:cs="Arial"/>
-              </w:rPr>
-              <w:t>col0}</w:t>
+              <w:t>{#rows}{col0}</w:t>
             </w:r>
           </w:p>
         </w:tc>
@@ -4326,21 +3120,7 @@
               <w:rPr>
                 <w:rFonts w:ascii="Arial" w:hAnsi="Arial" w:cs="Arial"/>
               </w:rPr>
-              <w:t>{col</w:t>
-            </w:r>
-            <w:proofErr w:type="gramStart"/>
-            <w:r>
-              <w:rPr>
-                <w:rFonts w:ascii="Arial" w:hAnsi="Arial" w:cs="Arial"/>
-              </w:rPr>
-              <w:t>5}{</w:t>
-            </w:r>
-            <w:proofErr w:type="gramEnd"/>
-            <w:r>
-              <w:rPr>
-                <w:rFonts w:ascii="Arial" w:hAnsi="Arial" w:cs="Arial"/>
-              </w:rPr>
-              <w:t>/rows}</w:t>
+              <w:t>{col5}{/rows}</w:t>
             </w:r>
           </w:p>
         </w:tc>
@@ -4357,21 +3137,7 @@
         <w:rPr>
           <w:rFonts w:ascii="Arial" w:hAnsi="Arial" w:cs="Arial"/>
         </w:rPr>
-        <w:t>{/is6</w:t>
-      </w:r>
-      <w:proofErr w:type="gramStart"/>
-      <w:r>
-        <w:rPr>
-          <w:rFonts w:ascii="Arial" w:hAnsi="Arial" w:cs="Arial"/>
-        </w:rPr>
-        <w:t>Col}{</w:t>
-      </w:r>
-      <w:proofErr w:type="gramEnd"/>
-      <w:r>
-        <w:rPr>
-          <w:rFonts w:ascii="Arial" w:hAnsi="Arial" w:cs="Arial"/>
-        </w:rPr>
-        <w:t>#is7Col}</w:t>
+        <w:t>{/is6Col}{#is7Col}</w:t>
       </w:r>
     </w:p>
     <w:tbl>
@@ -4410,21 +3176,7 @@
               <w:rPr>
                 <w:rFonts w:ascii="Arial" w:hAnsi="Arial" w:cs="Arial"/>
               </w:rPr>
-              <w:t>{#</w:t>
-            </w:r>
-            <w:proofErr w:type="gramStart"/>
-            <w:r>
-              <w:rPr>
-                <w:rFonts w:ascii="Arial" w:hAnsi="Arial" w:cs="Arial"/>
-              </w:rPr>
-              <w:t>header}{</w:t>
-            </w:r>
-            <w:proofErr w:type="gramEnd"/>
-            <w:r>
-              <w:rPr>
-                <w:rFonts w:ascii="Arial" w:hAnsi="Arial" w:cs="Arial"/>
-              </w:rPr>
-              <w:t>col0}</w:t>
+              <w:t>{#header}{col0}</w:t>
             </w:r>
           </w:p>
         </w:tc>
@@ -4544,21 +3296,7 @@
               <w:rPr>
                 <w:rFonts w:ascii="Arial" w:hAnsi="Arial" w:cs="Arial"/>
               </w:rPr>
-              <w:t>{col</w:t>
-            </w:r>
-            <w:proofErr w:type="gramStart"/>
-            <w:r>
-              <w:rPr>
-                <w:rFonts w:ascii="Arial" w:hAnsi="Arial" w:cs="Arial"/>
-              </w:rPr>
-              <w:t>6}{</w:t>
-            </w:r>
-            <w:proofErr w:type="gramEnd"/>
-            <w:r>
-              <w:rPr>
-                <w:rFonts w:ascii="Arial" w:hAnsi="Arial" w:cs="Arial"/>
-              </w:rPr>
-              <w:t>/header}</w:t>
+              <w:t>{col6}{/header}</w:t>
             </w:r>
           </w:p>
         </w:tc>
@@ -4583,21 +3321,7 @@
               <w:rPr>
                 <w:rFonts w:ascii="Arial" w:hAnsi="Arial" w:cs="Arial"/>
               </w:rPr>
-              <w:t>{#</w:t>
-            </w:r>
-            <w:proofErr w:type="gramStart"/>
-            <w:r>
-              <w:rPr>
-                <w:rFonts w:ascii="Arial" w:hAnsi="Arial" w:cs="Arial"/>
-              </w:rPr>
-              <w:t>rows}{</w:t>
-            </w:r>
-            <w:proofErr w:type="gramEnd"/>
-            <w:r>
-              <w:rPr>
-                <w:rFonts w:ascii="Arial" w:hAnsi="Arial" w:cs="Arial"/>
-              </w:rPr>
-              <w:t>col0}</w:t>
+              <w:t>{#rows}{col0}</w:t>
             </w:r>
           </w:p>
         </w:tc>
@@ -4717,21 +3441,7 @@
               <w:rPr>
                 <w:rFonts w:ascii="Arial" w:hAnsi="Arial" w:cs="Arial"/>
               </w:rPr>
-              <w:t>{col</w:t>
-            </w:r>
-            <w:proofErr w:type="gramStart"/>
-            <w:r>
-              <w:rPr>
-                <w:rFonts w:ascii="Arial" w:hAnsi="Arial" w:cs="Arial"/>
-              </w:rPr>
-              <w:t>6}{</w:t>
-            </w:r>
-            <w:proofErr w:type="gramEnd"/>
-            <w:r>
-              <w:rPr>
-                <w:rFonts w:ascii="Arial" w:hAnsi="Arial" w:cs="Arial"/>
-              </w:rPr>
-              <w:t>/rows}</w:t>
+              <w:t>{col6}{/rows}</w:t>
             </w:r>
           </w:p>
         </w:tc>
@@ -4748,21 +3458,7 @@
         <w:rPr>
           <w:rFonts w:ascii="Arial" w:hAnsi="Arial" w:cs="Arial"/>
         </w:rPr>
-        <w:t>{/is7</w:t>
-      </w:r>
-      <w:proofErr w:type="gramStart"/>
-      <w:r>
-        <w:rPr>
-          <w:rFonts w:ascii="Arial" w:hAnsi="Arial" w:cs="Arial"/>
-        </w:rPr>
-        <w:t>Col}{</w:t>
-      </w:r>
-      <w:proofErr w:type="gramEnd"/>
-      <w:r>
-        <w:rPr>
-          <w:rFonts w:ascii="Arial" w:hAnsi="Arial" w:cs="Arial"/>
-        </w:rPr>
-        <w:t>#is8Col}</w:t>
+        <w:t>{/is7Col}{#is8Col}</w:t>
       </w:r>
     </w:p>
     <w:tbl>
@@ -4802,21 +3498,7 @@
               <w:rPr>
                 <w:rFonts w:ascii="Arial" w:hAnsi="Arial" w:cs="Arial"/>
               </w:rPr>
-              <w:t>{#</w:t>
-            </w:r>
-            <w:proofErr w:type="gramStart"/>
-            <w:r>
-              <w:rPr>
-                <w:rFonts w:ascii="Arial" w:hAnsi="Arial" w:cs="Arial"/>
-              </w:rPr>
-              <w:t>header}{</w:t>
-            </w:r>
-            <w:proofErr w:type="gramEnd"/>
-            <w:r>
-              <w:rPr>
-                <w:rFonts w:ascii="Arial" w:hAnsi="Arial" w:cs="Arial"/>
-              </w:rPr>
-              <w:t>col0}</w:t>
+              <w:t>{#header}{col0}</w:t>
             </w:r>
           </w:p>
         </w:tc>
@@ -4956,21 +3638,7 @@
               <w:rPr>
                 <w:rFonts w:ascii="Arial" w:hAnsi="Arial" w:cs="Arial"/>
               </w:rPr>
-              <w:t>{col</w:t>
-            </w:r>
-            <w:proofErr w:type="gramStart"/>
-            <w:r>
-              <w:rPr>
-                <w:rFonts w:ascii="Arial" w:hAnsi="Arial" w:cs="Arial"/>
-              </w:rPr>
-              <w:t>7}{</w:t>
-            </w:r>
-            <w:proofErr w:type="gramEnd"/>
-            <w:r>
-              <w:rPr>
-                <w:rFonts w:ascii="Arial" w:hAnsi="Arial" w:cs="Arial"/>
-              </w:rPr>
-              <w:t>/header}</w:t>
+              <w:t>{col7}{/header}</w:t>
             </w:r>
           </w:p>
         </w:tc>
@@ -4995,21 +3663,7 @@
               <w:rPr>
                 <w:rFonts w:ascii="Arial" w:hAnsi="Arial" w:cs="Arial"/>
               </w:rPr>
-              <w:t>{#</w:t>
-            </w:r>
-            <w:proofErr w:type="gramStart"/>
-            <w:r>
-              <w:rPr>
-                <w:rFonts w:ascii="Arial" w:hAnsi="Arial" w:cs="Arial"/>
-              </w:rPr>
-              <w:t>rows}{</w:t>
-            </w:r>
-            <w:proofErr w:type="gramEnd"/>
-            <w:r>
-              <w:rPr>
-                <w:rFonts w:ascii="Arial" w:hAnsi="Arial" w:cs="Arial"/>
-              </w:rPr>
-              <w:t>col0}</w:t>
+              <w:t>{#rows}{col0}</w:t>
             </w:r>
           </w:p>
         </w:tc>
@@ -5149,21 +3803,7 @@
               <w:rPr>
                 <w:rFonts w:ascii="Arial" w:hAnsi="Arial" w:cs="Arial"/>
               </w:rPr>
-              <w:t>{col</w:t>
-            </w:r>
-            <w:proofErr w:type="gramStart"/>
-            <w:r>
-              <w:rPr>
-                <w:rFonts w:ascii="Arial" w:hAnsi="Arial" w:cs="Arial"/>
-              </w:rPr>
-              <w:t>7}{</w:t>
-            </w:r>
-            <w:proofErr w:type="gramEnd"/>
-            <w:r>
-              <w:rPr>
-                <w:rFonts w:ascii="Arial" w:hAnsi="Arial" w:cs="Arial"/>
-              </w:rPr>
-              <w:t>/rows}</w:t>
+              <w:t>{col7}{/rows}</w:t>
             </w:r>
           </w:p>
         </w:tc>
@@ -5180,21 +3820,7 @@
         <w:rPr>
           <w:rFonts w:ascii="Arial" w:hAnsi="Arial" w:cs="Arial"/>
         </w:rPr>
-        <w:t>{/is8</w:t>
-      </w:r>
-      <w:proofErr w:type="gramStart"/>
-      <w:r>
-        <w:rPr>
-          <w:rFonts w:ascii="Arial" w:hAnsi="Arial" w:cs="Arial"/>
-        </w:rPr>
-        <w:t>Col}{</w:t>
-      </w:r>
-      <w:proofErr w:type="gramEnd"/>
-      <w:r>
-        <w:rPr>
-          <w:rFonts w:ascii="Arial" w:hAnsi="Arial" w:cs="Arial"/>
-        </w:rPr>
-        <w:t>#is9Col}</w:t>
+        <w:t>{/is8Col}{#is9Col}</w:t>
       </w:r>
     </w:p>
     <w:tbl>
@@ -5235,21 +3861,7 @@
               <w:rPr>
                 <w:rFonts w:ascii="Arial" w:hAnsi="Arial" w:cs="Arial"/>
               </w:rPr>
-              <w:t>{#</w:t>
-            </w:r>
-            <w:proofErr w:type="gramStart"/>
-            <w:r>
-              <w:rPr>
-                <w:rFonts w:ascii="Arial" w:hAnsi="Arial" w:cs="Arial"/>
-              </w:rPr>
-              <w:t>header}{</w:t>
-            </w:r>
-            <w:proofErr w:type="gramEnd"/>
-            <w:r>
-              <w:rPr>
-                <w:rFonts w:ascii="Arial" w:hAnsi="Arial" w:cs="Arial"/>
-              </w:rPr>
-              <w:t>col0}</w:t>
+              <w:t>{#header}{col0}</w:t>
             </w:r>
           </w:p>
         </w:tc>
@@ -5409,21 +4021,7 @@
               <w:rPr>
                 <w:rFonts w:ascii="Arial" w:hAnsi="Arial" w:cs="Arial"/>
               </w:rPr>
-              <w:t>{col</w:t>
-            </w:r>
-            <w:proofErr w:type="gramStart"/>
-            <w:r>
-              <w:rPr>
-                <w:rFonts w:ascii="Arial" w:hAnsi="Arial" w:cs="Arial"/>
-              </w:rPr>
-              <w:t>8}{</w:t>
-            </w:r>
-            <w:proofErr w:type="gramEnd"/>
-            <w:r>
-              <w:rPr>
-                <w:rFonts w:ascii="Arial" w:hAnsi="Arial" w:cs="Arial"/>
-              </w:rPr>
-              <w:t>/header}</w:t>
+              <w:t>{col8}{/header}</w:t>
             </w:r>
           </w:p>
         </w:tc>
@@ -5448,21 +4046,7 @@
               <w:rPr>
                 <w:rFonts w:ascii="Arial" w:hAnsi="Arial" w:cs="Arial"/>
               </w:rPr>
-              <w:t>{#</w:t>
-            </w:r>
-            <w:proofErr w:type="gramStart"/>
-            <w:r>
-              <w:rPr>
-                <w:rFonts w:ascii="Arial" w:hAnsi="Arial" w:cs="Arial"/>
-              </w:rPr>
-              <w:t>rows}{</w:t>
-            </w:r>
-            <w:proofErr w:type="gramEnd"/>
-            <w:r>
-              <w:rPr>
-                <w:rFonts w:ascii="Arial" w:hAnsi="Arial" w:cs="Arial"/>
-              </w:rPr>
-              <w:t>col0}</w:t>
+              <w:t>{#rows}{col0}</w:t>
             </w:r>
           </w:p>
         </w:tc>
@@ -5622,21 +4206,7 @@
               <w:rPr>
                 <w:rFonts w:ascii="Arial" w:hAnsi="Arial" w:cs="Arial"/>
               </w:rPr>
-              <w:t>{col</w:t>
-            </w:r>
-            <w:proofErr w:type="gramStart"/>
-            <w:r>
-              <w:rPr>
-                <w:rFonts w:ascii="Arial" w:hAnsi="Arial" w:cs="Arial"/>
-              </w:rPr>
-              <w:t>8}{</w:t>
-            </w:r>
-            <w:proofErr w:type="gramEnd"/>
-            <w:r>
-              <w:rPr>
-                <w:rFonts w:ascii="Arial" w:hAnsi="Arial" w:cs="Arial"/>
-              </w:rPr>
-              <w:t>/rows}</w:t>
+              <w:t>{col8}{/rows}</w:t>
             </w:r>
           </w:p>
         </w:tc>
@@ -5653,21 +4223,7 @@
         <w:rPr>
           <w:rFonts w:ascii="Arial" w:hAnsi="Arial" w:cs="Arial"/>
         </w:rPr>
-        <w:t>{/is9</w:t>
-      </w:r>
-      <w:proofErr w:type="gramStart"/>
-      <w:r>
-        <w:rPr>
-          <w:rFonts w:ascii="Arial" w:hAnsi="Arial" w:cs="Arial"/>
-        </w:rPr>
-        <w:t>Col}{</w:t>
-      </w:r>
-      <w:proofErr w:type="gramEnd"/>
-      <w:r>
-        <w:rPr>
-          <w:rFonts w:ascii="Arial" w:hAnsi="Arial" w:cs="Arial"/>
-        </w:rPr>
-        <w:t>#is10Col}</w:t>
+        <w:t>{/is9Col}{#is10Col}</w:t>
       </w:r>
     </w:p>
     <w:tbl>
@@ -5709,21 +4265,7 @@
               <w:rPr>
                 <w:rFonts w:ascii="Arial" w:hAnsi="Arial" w:cs="Arial"/>
               </w:rPr>
-              <w:t>{#</w:t>
-            </w:r>
-            <w:proofErr w:type="gramStart"/>
-            <w:r>
-              <w:rPr>
-                <w:rFonts w:ascii="Arial" w:hAnsi="Arial" w:cs="Arial"/>
-              </w:rPr>
-              <w:t>header}{</w:t>
-            </w:r>
-            <w:proofErr w:type="gramEnd"/>
-            <w:r>
-              <w:rPr>
-                <w:rFonts w:ascii="Arial" w:hAnsi="Arial" w:cs="Arial"/>
-              </w:rPr>
-              <w:t>col0}</w:t>
+              <w:t>{#header}{col0}</w:t>
             </w:r>
           </w:p>
         </w:tc>
@@ -5903,21 +4445,7 @@
               <w:rPr>
                 <w:rFonts w:ascii="Arial" w:hAnsi="Arial" w:cs="Arial"/>
               </w:rPr>
-              <w:t>{col</w:t>
-            </w:r>
-            <w:proofErr w:type="gramStart"/>
-            <w:r>
-              <w:rPr>
-                <w:rFonts w:ascii="Arial" w:hAnsi="Arial" w:cs="Arial"/>
-              </w:rPr>
-              <w:t>9}{</w:t>
-            </w:r>
-            <w:proofErr w:type="gramEnd"/>
-            <w:r>
-              <w:rPr>
-                <w:rFonts w:ascii="Arial" w:hAnsi="Arial" w:cs="Arial"/>
-              </w:rPr>
-              <w:t>/header}</w:t>
+              <w:t>{col9}{/header}</w:t>
             </w:r>
           </w:p>
         </w:tc>
@@ -5942,21 +4470,7 @@
               <w:rPr>
                 <w:rFonts w:ascii="Arial" w:hAnsi="Arial" w:cs="Arial"/>
               </w:rPr>
-              <w:t>{#</w:t>
-            </w:r>
-            <w:proofErr w:type="gramStart"/>
-            <w:r>
-              <w:rPr>
-                <w:rFonts w:ascii="Arial" w:hAnsi="Arial" w:cs="Arial"/>
-              </w:rPr>
-              <w:t>rows}{</w:t>
-            </w:r>
-            <w:proofErr w:type="gramEnd"/>
-            <w:r>
-              <w:rPr>
-                <w:rFonts w:ascii="Arial" w:hAnsi="Arial" w:cs="Arial"/>
-              </w:rPr>
-              <w:t>col0}</w:t>
+              <w:t>{#rows}{col0}</w:t>
             </w:r>
           </w:p>
         </w:tc>
@@ -6136,21 +4650,7 @@
               <w:rPr>
                 <w:rFonts w:ascii="Arial" w:hAnsi="Arial" w:cs="Arial"/>
               </w:rPr>
-              <w:t>{col</w:t>
-            </w:r>
-            <w:proofErr w:type="gramStart"/>
-            <w:r>
-              <w:rPr>
-                <w:rFonts w:ascii="Arial" w:hAnsi="Arial" w:cs="Arial"/>
-              </w:rPr>
-              <w:t>9}{</w:t>
-            </w:r>
-            <w:proofErr w:type="gramEnd"/>
-            <w:r>
-              <w:rPr>
-                <w:rFonts w:ascii="Arial" w:hAnsi="Arial" w:cs="Arial"/>
-              </w:rPr>
-              <w:t>/rows}</w:t>
+              <w:t>{col9}{/rows}</w:t>
             </w:r>
           </w:p>
         </w:tc>
@@ -6167,21 +4667,7 @@
         <w:rPr>
           <w:rFonts w:ascii="Arial" w:hAnsi="Arial" w:cs="Arial"/>
         </w:rPr>
-        <w:t>{/is10</w:t>
-      </w:r>
-      <w:proofErr w:type="gramStart"/>
-      <w:r>
-        <w:rPr>
-          <w:rFonts w:ascii="Arial" w:hAnsi="Arial" w:cs="Arial"/>
-        </w:rPr>
-        <w:t>Col}{</w:t>
-      </w:r>
-      <w:proofErr w:type="gramEnd"/>
-      <w:r>
-        <w:rPr>
-          <w:rFonts w:ascii="Arial" w:hAnsi="Arial" w:cs="Arial"/>
-        </w:rPr>
-        <w:t>#is11Col}</w:t>
+        <w:t>{/is10Col}{#is11Col}</w:t>
       </w:r>
     </w:p>
     <w:tbl>
@@ -6224,21 +4710,7 @@
               <w:rPr>
                 <w:rFonts w:ascii="Arial" w:hAnsi="Arial" w:cs="Arial"/>
               </w:rPr>
-              <w:t>{#</w:t>
-            </w:r>
-            <w:proofErr w:type="gramStart"/>
-            <w:r>
-              <w:rPr>
-                <w:rFonts w:ascii="Arial" w:hAnsi="Arial" w:cs="Arial"/>
-              </w:rPr>
-              <w:t>header}{</w:t>
-            </w:r>
-            <w:proofErr w:type="gramEnd"/>
-            <w:r>
-              <w:rPr>
-                <w:rFonts w:ascii="Arial" w:hAnsi="Arial" w:cs="Arial"/>
-              </w:rPr>
-              <w:t>col0}</w:t>
+              <w:t>{#header}{col0}</w:t>
             </w:r>
           </w:p>
         </w:tc>
@@ -6438,21 +4910,7 @@
               <w:rPr>
                 <w:rFonts w:ascii="Arial" w:hAnsi="Arial" w:cs="Arial"/>
               </w:rPr>
-              <w:t>{col</w:t>
-            </w:r>
-            <w:proofErr w:type="gramStart"/>
-            <w:r>
-              <w:rPr>
-                <w:rFonts w:ascii="Arial" w:hAnsi="Arial" w:cs="Arial"/>
-              </w:rPr>
-              <w:t>10}{</w:t>
-            </w:r>
-            <w:proofErr w:type="gramEnd"/>
-            <w:r>
-              <w:rPr>
-                <w:rFonts w:ascii="Arial" w:hAnsi="Arial" w:cs="Arial"/>
-              </w:rPr>
-              <w:t>/header}</w:t>
+              <w:t>{col10}{/header}</w:t>
             </w:r>
           </w:p>
         </w:tc>
@@ -6477,21 +4935,7 @@
               <w:rPr>
                 <w:rFonts w:ascii="Arial" w:hAnsi="Arial" w:cs="Arial"/>
               </w:rPr>
-              <w:t>{#</w:t>
-            </w:r>
-            <w:proofErr w:type="gramStart"/>
-            <w:r>
-              <w:rPr>
-                <w:rFonts w:ascii="Arial" w:hAnsi="Arial" w:cs="Arial"/>
-              </w:rPr>
-              <w:t>rows}{</w:t>
-            </w:r>
-            <w:proofErr w:type="gramEnd"/>
-            <w:r>
-              <w:rPr>
-                <w:rFonts w:ascii="Arial" w:hAnsi="Arial" w:cs="Arial"/>
-              </w:rPr>
-              <w:t>col0}</w:t>
+              <w:t>{#rows}{col0}</w:t>
             </w:r>
           </w:p>
         </w:tc>
@@ -6691,21 +5135,7 @@
               <w:rPr>
                 <w:rFonts w:ascii="Arial" w:hAnsi="Arial" w:cs="Arial"/>
               </w:rPr>
-              <w:t>{col</w:t>
-            </w:r>
-            <w:proofErr w:type="gramStart"/>
-            <w:r>
-              <w:rPr>
-                <w:rFonts w:ascii="Arial" w:hAnsi="Arial" w:cs="Arial"/>
-              </w:rPr>
-              <w:t>10}{</w:t>
-            </w:r>
-            <w:proofErr w:type="gramEnd"/>
-            <w:r>
-              <w:rPr>
-                <w:rFonts w:ascii="Arial" w:hAnsi="Arial" w:cs="Arial"/>
-              </w:rPr>
-              <w:t>/rows}</w:t>
+              <w:t>{col10}{/rows}</w:t>
             </w:r>
           </w:p>
         </w:tc>
@@ -6722,21 +5152,7 @@
         <w:rPr>
           <w:rFonts w:ascii="Arial" w:hAnsi="Arial" w:cs="Arial"/>
         </w:rPr>
-        <w:t>{/is11</w:t>
-      </w:r>
-      <w:proofErr w:type="gramStart"/>
-      <w:r>
-        <w:rPr>
-          <w:rFonts w:ascii="Arial" w:hAnsi="Arial" w:cs="Arial"/>
-        </w:rPr>
-        <w:t>Col}{</w:t>
-      </w:r>
-      <w:proofErr w:type="gramEnd"/>
-      <w:r>
-        <w:rPr>
-          <w:rFonts w:ascii="Arial" w:hAnsi="Arial" w:cs="Arial"/>
-        </w:rPr>
-        <w:t>#is12Col}</w:t>
+        <w:t>{/is11Col}{#is12Col}</w:t>
       </w:r>
     </w:p>
     <w:tbl>
@@ -6780,21 +5196,7 @@
               <w:rPr>
                 <w:rFonts w:ascii="Arial" w:hAnsi="Arial" w:cs="Arial"/>
               </w:rPr>
-              <w:t>{#</w:t>
-            </w:r>
-            <w:proofErr w:type="gramStart"/>
-            <w:r>
-              <w:rPr>
-                <w:rFonts w:ascii="Arial" w:hAnsi="Arial" w:cs="Arial"/>
-              </w:rPr>
-              <w:t>header}{</w:t>
-            </w:r>
-            <w:proofErr w:type="gramEnd"/>
-            <w:r>
-              <w:rPr>
-                <w:rFonts w:ascii="Arial" w:hAnsi="Arial" w:cs="Arial"/>
-              </w:rPr>
-              <w:t>col0}</w:t>
+              <w:t>{#header}{col0}</w:t>
             </w:r>
           </w:p>
         </w:tc>
@@ -7014,21 +5416,7 @@
               <w:rPr>
                 <w:rFonts w:ascii="Arial" w:hAnsi="Arial" w:cs="Arial"/>
               </w:rPr>
-              <w:t>{col</w:t>
-            </w:r>
-            <w:proofErr w:type="gramStart"/>
-            <w:r>
-              <w:rPr>
-                <w:rFonts w:ascii="Arial" w:hAnsi="Arial" w:cs="Arial"/>
-              </w:rPr>
-              <w:t>11}{</w:t>
-            </w:r>
-            <w:proofErr w:type="gramEnd"/>
-            <w:r>
-              <w:rPr>
-                <w:rFonts w:ascii="Arial" w:hAnsi="Arial" w:cs="Arial"/>
-              </w:rPr>
-              <w:t>/header}</w:t>
+              <w:t>{col11}{/header}</w:t>
             </w:r>
           </w:p>
         </w:tc>
@@ -7053,21 +5441,7 @@
               <w:rPr>
                 <w:rFonts w:ascii="Arial" w:hAnsi="Arial" w:cs="Arial"/>
               </w:rPr>
-              <w:t>{#</w:t>
-            </w:r>
-            <w:proofErr w:type="gramStart"/>
-            <w:r>
-              <w:rPr>
-                <w:rFonts w:ascii="Arial" w:hAnsi="Arial" w:cs="Arial"/>
-              </w:rPr>
-              <w:t>rows}{</w:t>
-            </w:r>
-            <w:proofErr w:type="gramEnd"/>
-            <w:r>
-              <w:rPr>
-                <w:rFonts w:ascii="Arial" w:hAnsi="Arial" w:cs="Arial"/>
-              </w:rPr>
-              <w:t>col0}</w:t>
+              <w:t>{#rows}{col0}</w:t>
             </w:r>
           </w:p>
         </w:tc>
@@ -7287,21 +5661,7 @@
               <w:rPr>
                 <w:rFonts w:ascii="Arial" w:hAnsi="Arial" w:cs="Arial"/>
               </w:rPr>
-              <w:t>{col</w:t>
-            </w:r>
-            <w:proofErr w:type="gramStart"/>
-            <w:r>
-              <w:rPr>
-                <w:rFonts w:ascii="Arial" w:hAnsi="Arial" w:cs="Arial"/>
-              </w:rPr>
-              <w:t>11}{</w:t>
-            </w:r>
-            <w:proofErr w:type="gramEnd"/>
-            <w:r>
-              <w:rPr>
-                <w:rFonts w:ascii="Arial" w:hAnsi="Arial" w:cs="Arial"/>
-              </w:rPr>
-              <w:t>/rows}</w:t>
+              <w:t>{col11}{/rows}</w:t>
             </w:r>
           </w:p>
         </w:tc>
@@ -7318,24 +5678,9 @@
         <w:rPr>
           <w:rFonts w:ascii="Arial" w:hAnsi="Arial" w:cs="Arial"/>
         </w:rPr>
-        <w:t>{/is12</w:t>
-      </w:r>
-      <w:proofErr w:type="gramStart"/>
-      <w:r>
-        <w:rPr>
-          <w:rFonts w:ascii="Arial" w:hAnsi="Arial" w:cs="Arial"/>
-        </w:rPr>
-        <w:t>Col}{</w:t>
-      </w:r>
-      <w:proofErr w:type="gramEnd"/>
-      <w:r>
-        <w:rPr>
-          <w:rFonts w:ascii="Arial" w:hAnsi="Arial" w:cs="Arial"/>
-        </w:rPr>
-        <w:t>/</w:t>
+        <w:t>{/is12Col}{/</w:t>
       </w:r>
       <w:proofErr w:type="spellStart"/>
-      <w:proofErr w:type="gramStart"/>
       <w:r>
         <w:rPr>
           <w:rFonts w:ascii="Arial" w:hAnsi="Arial" w:cs="Arial"/>
@@ -7347,28 +5692,7 @@
         <w:rPr>
           <w:rFonts w:ascii="Arial" w:hAnsi="Arial" w:cs="Arial"/>
         </w:rPr>
-        <w:t>}{</w:t>
-      </w:r>
-      <w:proofErr w:type="gramEnd"/>
-      <w:r>
-        <w:rPr>
-          <w:rFonts w:ascii="Arial" w:hAnsi="Arial" w:cs="Arial"/>
-        </w:rPr>
-        <w:t>#</w:t>
-      </w:r>
-      <w:proofErr w:type="gramStart"/>
-      <w:r>
-        <w:rPr>
-          <w:rFonts w:ascii="Arial" w:hAnsi="Arial" w:cs="Arial"/>
-        </w:rPr>
-        <w:t>isAttachment}{</w:t>
-      </w:r>
-      <w:proofErr w:type="gramEnd"/>
-      <w:r>
-        <w:rPr>
-          <w:rFonts w:ascii="Arial" w:hAnsi="Arial" w:cs="Arial"/>
-        </w:rPr>
-        <w:t>#is1Col}</w:t>
+        <w:t>}{#isAttachment}{#is1Col}</w:t>
       </w:r>
     </w:p>
     <w:tbl>
@@ -7400,35 +5724,7 @@
               <w:rPr>
                 <w:rFonts w:ascii="Arial" w:hAnsi="Arial" w:cs="Arial"/>
               </w:rPr>
-              <w:t>{#</w:t>
-            </w:r>
-            <w:proofErr w:type="gramStart"/>
-            <w:r>
-              <w:rPr>
-                <w:rFonts w:ascii="Arial" w:hAnsi="Arial" w:cs="Arial"/>
-              </w:rPr>
-              <w:t>header}{</w:t>
-            </w:r>
-            <w:proofErr w:type="gramEnd"/>
-            <w:r>
-              <w:rPr>
-                <w:rFonts w:ascii="Arial" w:hAnsi="Arial" w:cs="Arial"/>
-              </w:rPr>
-              <w:t>col</w:t>
-            </w:r>
-            <w:proofErr w:type="gramStart"/>
-            <w:r>
-              <w:rPr>
-                <w:rFonts w:ascii="Arial" w:hAnsi="Arial" w:cs="Arial"/>
-              </w:rPr>
-              <w:t>0}{</w:t>
-            </w:r>
-            <w:proofErr w:type="gramEnd"/>
-            <w:r>
-              <w:rPr>
-                <w:rFonts w:ascii="Arial" w:hAnsi="Arial" w:cs="Arial"/>
-              </w:rPr>
-              <w:t>/header}</w:t>
+              <w:t>{#header}{col0}{/header}</w:t>
             </w:r>
           </w:p>
         </w:tc>
@@ -7510,21 +5806,7 @@
         <w:rPr>
           <w:rFonts w:ascii="Arial" w:hAnsi="Arial" w:cs="Arial"/>
         </w:rPr>
-        <w:t>{/is1</w:t>
-      </w:r>
-      <w:proofErr w:type="gramStart"/>
-      <w:r>
-        <w:rPr>
-          <w:rFonts w:ascii="Arial" w:hAnsi="Arial" w:cs="Arial"/>
-        </w:rPr>
-        <w:t>Col}{</w:t>
-      </w:r>
-      <w:proofErr w:type="gramEnd"/>
-      <w:r>
-        <w:rPr>
-          <w:rFonts w:ascii="Arial" w:hAnsi="Arial" w:cs="Arial"/>
-        </w:rPr>
-        <w:t>#is2Col}</w:t>
+        <w:t>{/is1Col}{#is2Col}</w:t>
       </w:r>
     </w:p>
     <w:tbl>
@@ -7557,21 +5839,7 @@
               <w:rPr>
                 <w:rFonts w:ascii="Arial" w:hAnsi="Arial" w:cs="Arial"/>
               </w:rPr>
-              <w:t>{#</w:t>
-            </w:r>
-            <w:proofErr w:type="gramStart"/>
-            <w:r>
-              <w:rPr>
-                <w:rFonts w:ascii="Arial" w:hAnsi="Arial" w:cs="Arial"/>
-              </w:rPr>
-              <w:t>header}{</w:t>
-            </w:r>
-            <w:proofErr w:type="gramEnd"/>
-            <w:r>
-              <w:rPr>
-                <w:rFonts w:ascii="Arial" w:hAnsi="Arial" w:cs="Arial"/>
-              </w:rPr>
-              <w:t>col0}</w:t>
+              <w:t>{#header}{col0}</w:t>
             </w:r>
           </w:p>
         </w:tc>
@@ -7591,21 +5859,7 @@
               <w:rPr>
                 <w:rFonts w:ascii="Arial" w:hAnsi="Arial" w:cs="Arial"/>
               </w:rPr>
-              <w:t>{col</w:t>
-            </w:r>
-            <w:proofErr w:type="gramStart"/>
-            <w:r>
-              <w:rPr>
-                <w:rFonts w:ascii="Arial" w:hAnsi="Arial" w:cs="Arial"/>
-              </w:rPr>
-              <w:t>1}{</w:t>
-            </w:r>
-            <w:proofErr w:type="gramEnd"/>
-            <w:r>
-              <w:rPr>
-                <w:rFonts w:ascii="Arial" w:hAnsi="Arial" w:cs="Arial"/>
-              </w:rPr>
-              <w:t>/header}</w:t>
+              <w:t>{col1}{/header}</w:t>
             </w:r>
           </w:p>
         </w:tc>
@@ -7630,21 +5884,7 @@
               <w:rPr>
                 <w:rFonts w:ascii="Arial" w:hAnsi="Arial" w:cs="Arial"/>
               </w:rPr>
-              <w:t>{#</w:t>
-            </w:r>
-            <w:proofErr w:type="gramStart"/>
-            <w:r>
-              <w:rPr>
-                <w:rFonts w:ascii="Arial" w:hAnsi="Arial" w:cs="Arial"/>
-              </w:rPr>
-              <w:t>rows}{</w:t>
-            </w:r>
-            <w:proofErr w:type="gramEnd"/>
-            <w:r>
-              <w:rPr>
-                <w:rFonts w:ascii="Arial" w:hAnsi="Arial" w:cs="Arial"/>
-              </w:rPr>
-              <w:t>col0}</w:t>
+              <w:t>{#rows}{col0}</w:t>
             </w:r>
           </w:p>
         </w:tc>
@@ -7664,21 +5904,7 @@
               <w:rPr>
                 <w:rFonts w:ascii="Arial" w:hAnsi="Arial" w:cs="Arial"/>
               </w:rPr>
-              <w:t>{col</w:t>
-            </w:r>
-            <w:proofErr w:type="gramStart"/>
-            <w:r>
-              <w:rPr>
-                <w:rFonts w:ascii="Arial" w:hAnsi="Arial" w:cs="Arial"/>
-              </w:rPr>
-              <w:t>1}{</w:t>
-            </w:r>
-            <w:proofErr w:type="gramEnd"/>
-            <w:r>
-              <w:rPr>
-                <w:rFonts w:ascii="Arial" w:hAnsi="Arial" w:cs="Arial"/>
-              </w:rPr>
-              <w:t>/rows}</w:t>
+              <w:t>{col1}{/rows}</w:t>
             </w:r>
           </w:p>
         </w:tc>
@@ -7695,21 +5921,7 @@
         <w:rPr>
           <w:rFonts w:ascii="Arial" w:hAnsi="Arial" w:cs="Arial"/>
         </w:rPr>
-        <w:t>{/is2</w:t>
-      </w:r>
-      <w:proofErr w:type="gramStart"/>
-      <w:r>
-        <w:rPr>
-          <w:rFonts w:ascii="Arial" w:hAnsi="Arial" w:cs="Arial"/>
-        </w:rPr>
-        <w:t>Col}{</w:t>
-      </w:r>
-      <w:proofErr w:type="gramEnd"/>
-      <w:r>
-        <w:rPr>
-          <w:rFonts w:ascii="Arial" w:hAnsi="Arial" w:cs="Arial"/>
-        </w:rPr>
-        <w:t>#is3Col}</w:t>
+        <w:t>{/is2Col}{#is3Col}</w:t>
       </w:r>
     </w:p>
     <w:tbl>
@@ -7744,21 +5956,7 @@
                 <w:rFonts w:ascii="Arial" w:hAnsi="Arial" w:cs="Arial"/>
               </w:rPr>
               <w:lastRenderedPageBreak/>
-              <w:t>{#</w:t>
-            </w:r>
-            <w:proofErr w:type="gramStart"/>
-            <w:r>
-              <w:rPr>
-                <w:rFonts w:ascii="Arial" w:hAnsi="Arial" w:cs="Arial"/>
-              </w:rPr>
-              <w:t>header}{</w:t>
-            </w:r>
-            <w:proofErr w:type="gramEnd"/>
-            <w:r>
-              <w:rPr>
-                <w:rFonts w:ascii="Arial" w:hAnsi="Arial" w:cs="Arial"/>
-              </w:rPr>
-              <w:t>col0}</w:t>
+              <w:t>{#header}{col0}</w:t>
             </w:r>
           </w:p>
         </w:tc>
@@ -7798,21 +5996,7 @@
               <w:rPr>
                 <w:rFonts w:ascii="Arial" w:hAnsi="Arial" w:cs="Arial"/>
               </w:rPr>
-              <w:t>{col</w:t>
-            </w:r>
-            <w:proofErr w:type="gramStart"/>
-            <w:r>
-              <w:rPr>
-                <w:rFonts w:ascii="Arial" w:hAnsi="Arial" w:cs="Arial"/>
-              </w:rPr>
-              <w:t>2}{</w:t>
-            </w:r>
-            <w:proofErr w:type="gramEnd"/>
-            <w:r>
-              <w:rPr>
-                <w:rFonts w:ascii="Arial" w:hAnsi="Arial" w:cs="Arial"/>
-              </w:rPr>
-              <w:t>/header}</w:t>
+              <w:t>{col2}{/header}</w:t>
             </w:r>
           </w:p>
         </w:tc>
@@ -7837,21 +6021,7 @@
               <w:rPr>
                 <w:rFonts w:ascii="Arial" w:hAnsi="Arial" w:cs="Arial"/>
               </w:rPr>
-              <w:t>{#</w:t>
-            </w:r>
-            <w:proofErr w:type="gramStart"/>
-            <w:r>
-              <w:rPr>
-                <w:rFonts w:ascii="Arial" w:hAnsi="Arial" w:cs="Arial"/>
-              </w:rPr>
-              <w:t>rows}{</w:t>
-            </w:r>
-            <w:proofErr w:type="gramEnd"/>
-            <w:r>
-              <w:rPr>
-                <w:rFonts w:ascii="Arial" w:hAnsi="Arial" w:cs="Arial"/>
-              </w:rPr>
-              <w:t>col0}</w:t>
+              <w:t>{#rows}{col0}</w:t>
             </w:r>
           </w:p>
         </w:tc>
@@ -7891,21 +6061,7 @@
               <w:rPr>
                 <w:rFonts w:ascii="Arial" w:hAnsi="Arial" w:cs="Arial"/>
               </w:rPr>
-              <w:t>{col</w:t>
-            </w:r>
-            <w:proofErr w:type="gramStart"/>
-            <w:r>
-              <w:rPr>
-                <w:rFonts w:ascii="Arial" w:hAnsi="Arial" w:cs="Arial"/>
-              </w:rPr>
-              <w:t>2}{</w:t>
-            </w:r>
-            <w:proofErr w:type="gramEnd"/>
-            <w:r>
-              <w:rPr>
-                <w:rFonts w:ascii="Arial" w:hAnsi="Arial" w:cs="Arial"/>
-              </w:rPr>
-              <w:t>/rows}</w:t>
+              <w:t>{col2}{/rows}</w:t>
             </w:r>
           </w:p>
         </w:tc>
@@ -7922,21 +6078,7 @@
         <w:rPr>
           <w:rFonts w:ascii="Arial" w:hAnsi="Arial" w:cs="Arial"/>
         </w:rPr>
-        <w:t>{/is3</w:t>
-      </w:r>
-      <w:proofErr w:type="gramStart"/>
-      <w:r>
-        <w:rPr>
-          <w:rFonts w:ascii="Arial" w:hAnsi="Arial" w:cs="Arial"/>
-        </w:rPr>
-        <w:t>Col}{</w:t>
-      </w:r>
-      <w:proofErr w:type="gramEnd"/>
-      <w:r>
-        <w:rPr>
-          <w:rFonts w:ascii="Arial" w:hAnsi="Arial" w:cs="Arial"/>
-        </w:rPr>
-        <w:t>#is4Col}</w:t>
+        <w:t>{/is3Col}{#is4Col}</w:t>
       </w:r>
     </w:p>
     <w:tbl>
@@ -7971,21 +6113,7 @@
               <w:rPr>
                 <w:rFonts w:ascii="Arial" w:hAnsi="Arial" w:cs="Arial"/>
               </w:rPr>
-              <w:t>{#</w:t>
-            </w:r>
-            <w:proofErr w:type="gramStart"/>
-            <w:r>
-              <w:rPr>
-                <w:rFonts w:ascii="Arial" w:hAnsi="Arial" w:cs="Arial"/>
-              </w:rPr>
-              <w:t>header}{</w:t>
-            </w:r>
-            <w:proofErr w:type="gramEnd"/>
-            <w:r>
-              <w:rPr>
-                <w:rFonts w:ascii="Arial" w:hAnsi="Arial" w:cs="Arial"/>
-              </w:rPr>
-              <w:t>col0}</w:t>
+              <w:t>{#header}{col0}</w:t>
             </w:r>
           </w:p>
         </w:tc>
@@ -8045,21 +6173,7 @@
               <w:rPr>
                 <w:rFonts w:ascii="Arial" w:hAnsi="Arial" w:cs="Arial"/>
               </w:rPr>
-              <w:t>{col</w:t>
-            </w:r>
-            <w:proofErr w:type="gramStart"/>
-            <w:r>
-              <w:rPr>
-                <w:rFonts w:ascii="Arial" w:hAnsi="Arial" w:cs="Arial"/>
-              </w:rPr>
-              <w:t>3}{</w:t>
-            </w:r>
-            <w:proofErr w:type="gramEnd"/>
-            <w:r>
-              <w:rPr>
-                <w:rFonts w:ascii="Arial" w:hAnsi="Arial" w:cs="Arial"/>
-              </w:rPr>
-              <w:t>/header}</w:t>
+              <w:t>{col3}{/header}</w:t>
             </w:r>
           </w:p>
         </w:tc>
@@ -8084,21 +6198,7 @@
               <w:rPr>
                 <w:rFonts w:ascii="Arial" w:hAnsi="Arial" w:cs="Arial"/>
               </w:rPr>
-              <w:t>{#</w:t>
-            </w:r>
-            <w:proofErr w:type="gramStart"/>
-            <w:r>
-              <w:rPr>
-                <w:rFonts w:ascii="Arial" w:hAnsi="Arial" w:cs="Arial"/>
-              </w:rPr>
-              <w:t>rows}{</w:t>
-            </w:r>
-            <w:proofErr w:type="gramEnd"/>
-            <w:r>
-              <w:rPr>
-                <w:rFonts w:ascii="Arial" w:hAnsi="Arial" w:cs="Arial"/>
-              </w:rPr>
-              <w:t>col0}</w:t>
+              <w:t>{#rows}{col0}</w:t>
             </w:r>
           </w:p>
         </w:tc>
@@ -8158,21 +6258,7 @@
               <w:rPr>
                 <w:rFonts w:ascii="Arial" w:hAnsi="Arial" w:cs="Arial"/>
               </w:rPr>
-              <w:t>{col</w:t>
-            </w:r>
-            <w:proofErr w:type="gramStart"/>
-            <w:r>
-              <w:rPr>
-                <w:rFonts w:ascii="Arial" w:hAnsi="Arial" w:cs="Arial"/>
-              </w:rPr>
-              <w:t>3}{</w:t>
-            </w:r>
-            <w:proofErr w:type="gramEnd"/>
-            <w:r>
-              <w:rPr>
-                <w:rFonts w:ascii="Arial" w:hAnsi="Arial" w:cs="Arial"/>
-              </w:rPr>
-              <w:t>/rows}</w:t>
+              <w:t>{col3}{/rows}</w:t>
             </w:r>
           </w:p>
         </w:tc>
@@ -8189,21 +6275,7 @@
         <w:rPr>
           <w:rFonts w:ascii="Arial" w:hAnsi="Arial" w:cs="Arial"/>
         </w:rPr>
-        <w:t>{/is4</w:t>
-      </w:r>
-      <w:proofErr w:type="gramStart"/>
-      <w:r>
-        <w:rPr>
-          <w:rFonts w:ascii="Arial" w:hAnsi="Arial" w:cs="Arial"/>
-        </w:rPr>
-        <w:t>Col}{</w:t>
-      </w:r>
-      <w:proofErr w:type="gramEnd"/>
-      <w:r>
-        <w:rPr>
-          <w:rFonts w:ascii="Arial" w:hAnsi="Arial" w:cs="Arial"/>
-        </w:rPr>
-        <w:t>#is5Col}</w:t>
+        <w:t>{/is4Col}{#is5Col}</w:t>
       </w:r>
     </w:p>
     <w:tbl>
@@ -8239,21 +6311,7 @@
               <w:rPr>
                 <w:rFonts w:ascii="Arial" w:hAnsi="Arial" w:cs="Arial"/>
               </w:rPr>
-              <w:t>{#</w:t>
-            </w:r>
-            <w:proofErr w:type="gramStart"/>
-            <w:r>
-              <w:rPr>
-                <w:rFonts w:ascii="Arial" w:hAnsi="Arial" w:cs="Arial"/>
-              </w:rPr>
-              <w:t>header}{</w:t>
-            </w:r>
-            <w:proofErr w:type="gramEnd"/>
-            <w:r>
-              <w:rPr>
-                <w:rFonts w:ascii="Arial" w:hAnsi="Arial" w:cs="Arial"/>
-              </w:rPr>
-              <w:t>col0}</w:t>
+              <w:t>{#header}{col0}</w:t>
             </w:r>
           </w:p>
         </w:tc>
@@ -8333,21 +6391,7 @@
               <w:rPr>
                 <w:rFonts w:ascii="Arial" w:hAnsi="Arial" w:cs="Arial"/>
               </w:rPr>
-              <w:t>{col</w:t>
-            </w:r>
-            <w:proofErr w:type="gramStart"/>
-            <w:r>
-              <w:rPr>
-                <w:rFonts w:ascii="Arial" w:hAnsi="Arial" w:cs="Arial"/>
-              </w:rPr>
-              <w:t>4}{</w:t>
-            </w:r>
-            <w:proofErr w:type="gramEnd"/>
-            <w:r>
-              <w:rPr>
-                <w:rFonts w:ascii="Arial" w:hAnsi="Arial" w:cs="Arial"/>
-              </w:rPr>
-              <w:t>/header}</w:t>
+              <w:t>{col4}{/header}</w:t>
             </w:r>
           </w:p>
         </w:tc>
@@ -8372,21 +6416,7 @@
               <w:rPr>
                 <w:rFonts w:ascii="Arial" w:hAnsi="Arial" w:cs="Arial"/>
               </w:rPr>
-              <w:t>{#</w:t>
-            </w:r>
-            <w:proofErr w:type="gramStart"/>
-            <w:r>
-              <w:rPr>
-                <w:rFonts w:ascii="Arial" w:hAnsi="Arial" w:cs="Arial"/>
-              </w:rPr>
-              <w:t>rows}{</w:t>
-            </w:r>
-            <w:proofErr w:type="gramEnd"/>
-            <w:r>
-              <w:rPr>
-                <w:rFonts w:ascii="Arial" w:hAnsi="Arial" w:cs="Arial"/>
-              </w:rPr>
-              <w:t>col0}</w:t>
+              <w:t>{#rows}{col0}</w:t>
             </w:r>
           </w:p>
         </w:tc>
@@ -8466,21 +6496,7 @@
               <w:rPr>
                 <w:rFonts w:ascii="Arial" w:hAnsi="Arial" w:cs="Arial"/>
               </w:rPr>
-              <w:t>{col</w:t>
-            </w:r>
-            <w:proofErr w:type="gramStart"/>
-            <w:r>
-              <w:rPr>
-                <w:rFonts w:ascii="Arial" w:hAnsi="Arial" w:cs="Arial"/>
-              </w:rPr>
-              <w:t>4}{</w:t>
-            </w:r>
-            <w:proofErr w:type="gramEnd"/>
-            <w:r>
-              <w:rPr>
-                <w:rFonts w:ascii="Arial" w:hAnsi="Arial" w:cs="Arial"/>
-              </w:rPr>
-              <w:t>/rows}</w:t>
+              <w:t>{col4}{/rows}</w:t>
             </w:r>
           </w:p>
         </w:tc>
@@ -8497,21 +6513,7 @@
         <w:rPr>
           <w:rFonts w:ascii="Arial" w:hAnsi="Arial" w:cs="Arial"/>
         </w:rPr>
-        <w:t>{/is5</w:t>
-      </w:r>
-      <w:proofErr w:type="gramStart"/>
-      <w:r>
-        <w:rPr>
-          <w:rFonts w:ascii="Arial" w:hAnsi="Arial" w:cs="Arial"/>
-        </w:rPr>
-        <w:t>Col}{</w:t>
-      </w:r>
-      <w:proofErr w:type="gramEnd"/>
-      <w:r>
-        <w:rPr>
-          <w:rFonts w:ascii="Arial" w:hAnsi="Arial" w:cs="Arial"/>
-        </w:rPr>
-        <w:t>#is6Col}</w:t>
+        <w:t>{/is5Col}{#is6Col}</w:t>
       </w:r>
     </w:p>
     <w:tbl>
@@ -8548,21 +6550,7 @@
               <w:rPr>
                 <w:rFonts w:ascii="Arial" w:hAnsi="Arial" w:cs="Arial"/>
               </w:rPr>
-              <w:t>{#</w:t>
-            </w:r>
-            <w:proofErr w:type="gramStart"/>
-            <w:r>
-              <w:rPr>
-                <w:rFonts w:ascii="Arial" w:hAnsi="Arial" w:cs="Arial"/>
-              </w:rPr>
-              <w:t>header}{</w:t>
-            </w:r>
-            <w:proofErr w:type="gramEnd"/>
-            <w:r>
-              <w:rPr>
-                <w:rFonts w:ascii="Arial" w:hAnsi="Arial" w:cs="Arial"/>
-              </w:rPr>
-              <w:t>col0}</w:t>
+              <w:t>{#header}{col0}</w:t>
             </w:r>
           </w:p>
         </w:tc>
@@ -8662,21 +6650,7 @@
               <w:rPr>
                 <w:rFonts w:ascii="Arial" w:hAnsi="Arial" w:cs="Arial"/>
               </w:rPr>
-              <w:t>{col</w:t>
-            </w:r>
-            <w:proofErr w:type="gramStart"/>
-            <w:r>
-              <w:rPr>
-                <w:rFonts w:ascii="Arial" w:hAnsi="Arial" w:cs="Arial"/>
-              </w:rPr>
-              <w:t>5}{</w:t>
-            </w:r>
-            <w:proofErr w:type="gramEnd"/>
-            <w:r>
-              <w:rPr>
-                <w:rFonts w:ascii="Arial" w:hAnsi="Arial" w:cs="Arial"/>
-              </w:rPr>
-              <w:t>/header}</w:t>
+              <w:t>{col5}{/header}</w:t>
             </w:r>
           </w:p>
         </w:tc>
@@ -8701,21 +6675,7 @@
               <w:rPr>
                 <w:rFonts w:ascii="Arial" w:hAnsi="Arial" w:cs="Arial"/>
               </w:rPr>
-              <w:t>{#</w:t>
-            </w:r>
-            <w:proofErr w:type="gramStart"/>
-            <w:r>
-              <w:rPr>
-                <w:rFonts w:ascii="Arial" w:hAnsi="Arial" w:cs="Arial"/>
-              </w:rPr>
-              <w:t>rows}{</w:t>
-            </w:r>
-            <w:proofErr w:type="gramEnd"/>
-            <w:r>
-              <w:rPr>
-                <w:rFonts w:ascii="Arial" w:hAnsi="Arial" w:cs="Arial"/>
-              </w:rPr>
-              <w:t>col0}</w:t>
+              <w:t>{#rows}{col0}</w:t>
             </w:r>
           </w:p>
         </w:tc>
@@ -8815,21 +6775,7 @@
               <w:rPr>
                 <w:rFonts w:ascii="Arial" w:hAnsi="Arial" w:cs="Arial"/>
               </w:rPr>
-              <w:t>{col</w:t>
-            </w:r>
-            <w:proofErr w:type="gramStart"/>
-            <w:r>
-              <w:rPr>
-                <w:rFonts w:ascii="Arial" w:hAnsi="Arial" w:cs="Arial"/>
-              </w:rPr>
-              <w:t>5}{</w:t>
-            </w:r>
-            <w:proofErr w:type="gramEnd"/>
-            <w:r>
-              <w:rPr>
-                <w:rFonts w:ascii="Arial" w:hAnsi="Arial" w:cs="Arial"/>
-              </w:rPr>
-              <w:t>/rows}</w:t>
+              <w:t>{col5}{/rows}</w:t>
             </w:r>
           </w:p>
         </w:tc>
@@ -8846,21 +6792,7 @@
         <w:rPr>
           <w:rFonts w:ascii="Arial" w:hAnsi="Arial" w:cs="Arial"/>
         </w:rPr>
-        <w:t>{/is6</w:t>
-      </w:r>
-      <w:proofErr w:type="gramStart"/>
-      <w:r>
-        <w:rPr>
-          <w:rFonts w:ascii="Arial" w:hAnsi="Arial" w:cs="Arial"/>
-        </w:rPr>
-        <w:t>Col}{</w:t>
-      </w:r>
-      <w:proofErr w:type="gramEnd"/>
-      <w:r>
-        <w:rPr>
-          <w:rFonts w:ascii="Arial" w:hAnsi="Arial" w:cs="Arial"/>
-        </w:rPr>
-        <w:t>#is7Col}</w:t>
+        <w:t>{/is6Col}{#is7Col}</w:t>
       </w:r>
     </w:p>
     <w:tbl>
@@ -8898,21 +6830,7 @@
               <w:rPr>
                 <w:rFonts w:ascii="Arial" w:hAnsi="Arial" w:cs="Arial"/>
               </w:rPr>
-              <w:t>{#</w:t>
-            </w:r>
-            <w:proofErr w:type="gramStart"/>
-            <w:r>
-              <w:rPr>
-                <w:rFonts w:ascii="Arial" w:hAnsi="Arial" w:cs="Arial"/>
-              </w:rPr>
-              <w:t>header}{</w:t>
-            </w:r>
-            <w:proofErr w:type="gramEnd"/>
-            <w:r>
-              <w:rPr>
-                <w:rFonts w:ascii="Arial" w:hAnsi="Arial" w:cs="Arial"/>
-              </w:rPr>
-              <w:t>col0}</w:t>
+              <w:t>{#header}{col0}</w:t>
             </w:r>
           </w:p>
         </w:tc>
@@ -9032,21 +6950,7 @@
               <w:rPr>
                 <w:rFonts w:ascii="Arial" w:hAnsi="Arial" w:cs="Arial"/>
               </w:rPr>
-              <w:t>{col</w:t>
-            </w:r>
-            <w:proofErr w:type="gramStart"/>
-            <w:r>
-              <w:rPr>
-                <w:rFonts w:ascii="Arial" w:hAnsi="Arial" w:cs="Arial"/>
-              </w:rPr>
-              <w:t>6}{</w:t>
-            </w:r>
-            <w:proofErr w:type="gramEnd"/>
-            <w:r>
-              <w:rPr>
-                <w:rFonts w:ascii="Arial" w:hAnsi="Arial" w:cs="Arial"/>
-              </w:rPr>
-              <w:t>/header}</w:t>
+              <w:t>{col6}{/header}</w:t>
             </w:r>
           </w:p>
         </w:tc>
@@ -9071,21 +6975,7 @@
               <w:rPr>
                 <w:rFonts w:ascii="Arial" w:hAnsi="Arial" w:cs="Arial"/>
               </w:rPr>
-              <w:t>{#</w:t>
-            </w:r>
-            <w:proofErr w:type="gramStart"/>
-            <w:r>
-              <w:rPr>
-                <w:rFonts w:ascii="Arial" w:hAnsi="Arial" w:cs="Arial"/>
-              </w:rPr>
-              <w:t>rows}{</w:t>
-            </w:r>
-            <w:proofErr w:type="gramEnd"/>
-            <w:r>
-              <w:rPr>
-                <w:rFonts w:ascii="Arial" w:hAnsi="Arial" w:cs="Arial"/>
-              </w:rPr>
-              <w:t>col0}</w:t>
+              <w:t>{#rows}{col0}</w:t>
             </w:r>
           </w:p>
         </w:tc>
@@ -9205,21 +7095,7 @@
               <w:rPr>
                 <w:rFonts w:ascii="Arial" w:hAnsi="Arial" w:cs="Arial"/>
               </w:rPr>
-              <w:t>{col</w:t>
-            </w:r>
-            <w:proofErr w:type="gramStart"/>
-            <w:r>
-              <w:rPr>
-                <w:rFonts w:ascii="Arial" w:hAnsi="Arial" w:cs="Arial"/>
-              </w:rPr>
-              <w:t>6}{</w:t>
-            </w:r>
-            <w:proofErr w:type="gramEnd"/>
-            <w:r>
-              <w:rPr>
-                <w:rFonts w:ascii="Arial" w:hAnsi="Arial" w:cs="Arial"/>
-              </w:rPr>
-              <w:t>/rows}</w:t>
+              <w:t>{col6}{/rows}</w:t>
             </w:r>
           </w:p>
         </w:tc>
@@ -9236,24 +7112,9 @@
         <w:rPr>
           <w:rFonts w:ascii="Arial" w:hAnsi="Arial" w:cs="Arial"/>
         </w:rPr>
-        <w:t>{/is7</w:t>
-      </w:r>
-      <w:proofErr w:type="gramStart"/>
-      <w:r>
-        <w:rPr>
-          <w:rFonts w:ascii="Arial" w:hAnsi="Arial" w:cs="Arial"/>
-        </w:rPr>
-        <w:t>Col}{</w:t>
-      </w:r>
-      <w:proofErr w:type="gramEnd"/>
-      <w:r>
-        <w:rPr>
-          <w:rFonts w:ascii="Arial" w:hAnsi="Arial" w:cs="Arial"/>
-        </w:rPr>
-        <w:t>/</w:t>
+        <w:t>{/is7Col}{/</w:t>
       </w:r>
       <w:proofErr w:type="spellStart"/>
-      <w:proofErr w:type="gramStart"/>
       <w:r>
         <w:rPr>
           <w:rFonts w:ascii="Arial" w:hAnsi="Arial" w:cs="Arial"/>
@@ -9265,17 +7126,9 @@
         <w:rPr>
           <w:rFonts w:ascii="Arial" w:hAnsi="Arial" w:cs="Arial"/>
         </w:rPr>
-        <w:t>}{</w:t>
-      </w:r>
-      <w:proofErr w:type="gramEnd"/>
-      <w:r>
-        <w:rPr>
-          <w:rFonts w:ascii="Arial" w:hAnsi="Arial" w:cs="Arial"/>
-        </w:rPr>
-        <w:t>/</w:t>
+        <w:t>}{/</w:t>
       </w:r>
       <w:proofErr w:type="spellStart"/>
-      <w:proofErr w:type="gramStart"/>
       <w:r>
         <w:rPr>
           <w:rFonts w:ascii="Arial" w:hAnsi="Arial" w:cs="Arial"/>
@@ -9287,14 +7140,7 @@
         <w:rPr>
           <w:rFonts w:ascii="Arial" w:hAnsi="Arial" w:cs="Arial"/>
         </w:rPr>
-        <w:t>}{</w:t>
-      </w:r>
-      <w:proofErr w:type="gramEnd"/>
-      <w:r>
-        <w:rPr>
-          <w:rFonts w:ascii="Arial" w:hAnsi="Arial" w:cs="Arial"/>
-        </w:rPr>
-        <w:t>#isImage}</w:t>
+        <w:t>}{#isImage}</w:t>
       </w:r>
     </w:p>
     <w:p>
@@ -9311,7 +7157,6 @@
         <w:t>{%</w:t>
       </w:r>
       <w:proofErr w:type="spellStart"/>
-      <w:proofErr w:type="gramStart"/>
       <w:r>
         <w:rPr>
           <w:rFonts w:ascii="Arial" w:hAnsi="Arial" w:cs="Arial"/>
@@ -9323,17 +7168,9 @@
         <w:rPr>
           <w:rFonts w:ascii="Arial" w:hAnsi="Arial" w:cs="Arial"/>
         </w:rPr>
-        <w:t>}{</w:t>
-      </w:r>
-      <w:proofErr w:type="gramEnd"/>
-      <w:r>
-        <w:rPr>
-          <w:rFonts w:ascii="Arial" w:hAnsi="Arial" w:cs="Arial"/>
-        </w:rPr>
-        <w:t>/</w:t>
+        <w:t>}{/</w:t>
       </w:r>
       <w:proofErr w:type="spellStart"/>
-      <w:proofErr w:type="gramStart"/>
       <w:r>
         <w:rPr>
           <w:rFonts w:ascii="Arial" w:hAnsi="Arial" w:cs="Arial"/>
@@ -9345,42 +7182,7 @@
         <w:rPr>
           <w:rFonts w:ascii="Arial" w:hAnsi="Arial" w:cs="Arial"/>
         </w:rPr>
-        <w:t>}{</w:t>
-      </w:r>
-      <w:proofErr w:type="gramEnd"/>
-      <w:r>
-        <w:rPr>
-          <w:rFonts w:ascii="Arial" w:hAnsi="Arial" w:cs="Arial"/>
-        </w:rPr>
-        <w:t>/</w:t>
-      </w:r>
-      <w:proofErr w:type="gramStart"/>
-      <w:r>
-        <w:rPr>
-          <w:rFonts w:ascii="Arial" w:hAnsi="Arial" w:cs="Arial"/>
-        </w:rPr>
-        <w:t>blocks}{</w:t>
-      </w:r>
-      <w:proofErr w:type="gramEnd"/>
-      <w:r>
-        <w:rPr>
-          <w:rFonts w:ascii="Arial" w:hAnsi="Arial" w:cs="Arial"/>
-        </w:rPr>
-        <w:t>/</w:t>
-      </w:r>
-      <w:proofErr w:type="gramStart"/>
-      <w:r>
-        <w:rPr>
-          <w:rFonts w:ascii="Arial" w:hAnsi="Arial" w:cs="Arial"/>
-        </w:rPr>
-        <w:t>modules}{</w:t>
-      </w:r>
-      <w:proofErr w:type="gramEnd"/>
-      <w:r>
-        <w:rPr>
-          <w:rFonts w:ascii="Arial" w:hAnsi="Arial" w:cs="Arial"/>
-        </w:rPr>
-        <w:t>^</w:t>
+        <w:t>}{/blocks}{/modules}{^</w:t>
       </w:r>
       <w:proofErr w:type="spellStart"/>
       <w:r>
@@ -9408,21 +7210,7 @@
         <w:rPr>
           <w:rFonts w:ascii="Arial" w:hAnsi="Arial" w:cs="Arial"/>
         </w:rPr>
-        <w:t xml:space="preserve">No modules assigned to this </w:t>
-      </w:r>
-      <w:proofErr w:type="gramStart"/>
-      <w:r>
-        <w:rPr>
-          <w:rFonts w:ascii="Arial" w:hAnsi="Arial" w:cs="Arial"/>
-        </w:rPr>
-        <w:t>section.{</w:t>
-      </w:r>
-      <w:proofErr w:type="gramEnd"/>
-      <w:r>
-        <w:rPr>
-          <w:rFonts w:ascii="Arial" w:hAnsi="Arial" w:cs="Arial"/>
-        </w:rPr>
-        <w:t>/</w:t>
+        <w:t>No modules assigned to this section.{/</w:t>
       </w:r>
       <w:proofErr w:type="spellStart"/>
       <w:r>
@@ -9475,24 +7263,9 @@
           <w:rFonts w:ascii="Arial" w:hAnsi="Arial" w:cs="Arial"/>
         </w:rPr>
         <w:lastRenderedPageBreak/>
-        <w:t>{/</w:t>
-      </w:r>
-      <w:proofErr w:type="gramStart"/>
-      <w:r>
-        <w:rPr>
-          <w:rFonts w:ascii="Arial" w:hAnsi="Arial" w:cs="Arial"/>
-        </w:rPr>
-        <w:t>sections}{</w:t>
-      </w:r>
-      <w:proofErr w:type="gramEnd"/>
-      <w:r>
-        <w:rPr>
-          <w:rFonts w:ascii="Arial" w:hAnsi="Arial" w:cs="Arial"/>
-        </w:rPr>
-        <w:t>^</w:t>
+        <w:t>{/sections}{^</w:t>
       </w:r>
       <w:proofErr w:type="spellStart"/>
-      <w:proofErr w:type="gramStart"/>
       <w:r>
         <w:rPr>
           <w:rFonts w:ascii="Arial" w:hAnsi="Arial" w:cs="Arial"/>
@@ -9504,28 +7277,7 @@
         <w:rPr>
           <w:rFonts w:ascii="Arial" w:hAnsi="Arial" w:cs="Arial"/>
         </w:rPr>
-        <w:t>}No</w:t>
-      </w:r>
-      <w:proofErr w:type="gramEnd"/>
-      <w:r>
-        <w:rPr>
-          <w:rFonts w:ascii="Arial" w:hAnsi="Arial" w:cs="Arial"/>
-        </w:rPr>
-        <w:t xml:space="preserve"> sections </w:t>
-      </w:r>
-      <w:proofErr w:type="gramStart"/>
-      <w:r>
-        <w:rPr>
-          <w:rFonts w:ascii="Arial" w:hAnsi="Arial" w:cs="Arial"/>
-        </w:rPr>
-        <w:t>found.{</w:t>
-      </w:r>
-      <w:proofErr w:type="gramEnd"/>
-      <w:r>
-        <w:rPr>
-          <w:rFonts w:ascii="Arial" w:hAnsi="Arial" w:cs="Arial"/>
-        </w:rPr>
-        <w:t>/</w:t>
+        <w:t>}No sections found.{/</w:t>
       </w:r>
       <w:proofErr w:type="spellStart"/>
       <w:r>
@@ -13169,7 +10921,14 @@
 </file>
 
 <file path=customXml/item1.xml><?xml version="1.0" encoding="utf-8"?>
-<b:Sources xmlns:b="http://schemas.openxmlformats.org/officeDocument/2006/bibliography" xmlns="http://schemas.openxmlformats.org/officeDocument/2006/bibliography" SelectedStyle="\APASixthEditionOfficeOnline.xsl" StyleName="APA" Version="6"/>
+<p:properties xmlns:p="http://schemas.microsoft.com/office/2006/metadata/properties" xmlns:xsi="http://www.w3.org/2001/XMLSchema-instance" xmlns:pc="http://schemas.microsoft.com/office/infopath/2007/PartnerControls">
+  <documentManagement>
+    <lcf76f155ced4ddcb4097134ff3c332f xmlns="1a803baa-e9df-4a23-bfb0-3d52ab6a3357">
+      <Terms xmlns="http://schemas.microsoft.com/office/infopath/2007/PartnerControls"/>
+    </lcf76f155ced4ddcb4097134ff3c332f>
+    <TaxCatchAll xmlns="1dc1e81a-280f-431a-8325-76280f46d8cc" xsi:nil="true"/>
+  </documentManagement>
+</p:properties>
 </file>
 
 <file path=customXml/item2.xml><?xml version="1.0" encoding="utf-8"?>
@@ -13182,14 +10941,7 @@
 </file>
 
 <file path=customXml/item3.xml><?xml version="1.0" encoding="utf-8"?>
-<p:properties xmlns:p="http://schemas.microsoft.com/office/2006/metadata/properties" xmlns:xsi="http://www.w3.org/2001/XMLSchema-instance" xmlns:pc="http://schemas.microsoft.com/office/infopath/2007/PartnerControls">
-  <documentManagement>
-    <lcf76f155ced4ddcb4097134ff3c332f xmlns="1a803baa-e9df-4a23-bfb0-3d52ab6a3357">
-      <Terms xmlns="http://schemas.microsoft.com/office/infopath/2007/PartnerControls"/>
-    </lcf76f155ced4ddcb4097134ff3c332f>
-    <TaxCatchAll xmlns="1dc1e81a-280f-431a-8325-76280f46d8cc" xsi:nil="true"/>
-  </documentManagement>
-</p:properties>
+<b:Sources xmlns:b="http://schemas.openxmlformats.org/officeDocument/2006/bibliography" xmlns="http://schemas.openxmlformats.org/officeDocument/2006/bibliography" SelectedStyle="\APASixthEditionOfficeOnline.xsl" StyleName="APA" Version="6"/>
 </file>
 
 <file path=customXml/item4.xml><?xml version="1.0" encoding="utf-8"?>
@@ -13394,9 +11146,12 @@
 </file>
 
 <file path=customXml/itemProps1.xml><?xml version="1.0" encoding="utf-8"?>
-<ds:datastoreItem xmlns:ds="http://schemas.openxmlformats.org/officeDocument/2006/customXml" ds:itemID="{5FC80C9D-B699-4FA9-A5BA-04242B88ABD1}">
+<ds:datastoreItem xmlns:ds="http://schemas.openxmlformats.org/officeDocument/2006/customXml" ds:itemID="{67C57FFD-7733-498D-9DE4-45956E93E164}">
   <ds:schemaRefs>
-    <ds:schemaRef ds:uri="http://schemas.openxmlformats.org/officeDocument/2006/bibliography"/>
+    <ds:schemaRef ds:uri="http://schemas.microsoft.com/office/2006/metadata/properties"/>
+    <ds:schemaRef ds:uri="http://schemas.microsoft.com/office/infopath/2007/PartnerControls"/>
+    <ds:schemaRef ds:uri="1a803baa-e9df-4a23-bfb0-3d52ab6a3357"/>
+    <ds:schemaRef ds:uri="1dc1e81a-280f-431a-8325-76280f46d8cc"/>
   </ds:schemaRefs>
 </ds:datastoreItem>
 </file>
@@ -13410,12 +11165,9 @@
 </file>
 
 <file path=customXml/itemProps3.xml><?xml version="1.0" encoding="utf-8"?>
-<ds:datastoreItem xmlns:ds="http://schemas.openxmlformats.org/officeDocument/2006/customXml" ds:itemID="{67C57FFD-7733-498D-9DE4-45956E93E164}">
+<ds:datastoreItem xmlns:ds="http://schemas.openxmlformats.org/officeDocument/2006/customXml" ds:itemID="{5FC80C9D-B699-4FA9-A5BA-04242B88ABD1}">
   <ds:schemaRefs>
-    <ds:schemaRef ds:uri="http://schemas.microsoft.com/office/2006/metadata/properties"/>
-    <ds:schemaRef ds:uri="http://schemas.microsoft.com/office/infopath/2007/PartnerControls"/>
-    <ds:schemaRef ds:uri="1a803baa-e9df-4a23-bfb0-3d52ab6a3357"/>
-    <ds:schemaRef ds:uri="1dc1e81a-280f-431a-8325-76280f46d8cc"/>
+    <ds:schemaRef ds:uri="http://schemas.openxmlformats.org/officeDocument/2006/bibliography"/>
   </ds:schemaRefs>
 </ds:datastoreItem>
 </file>

</xml_diff>